<commit_message>
finish software architecture notes
</commit_message>
<xml_diff>
--- a/SWARD/Exam preparation/For Architecture.docx
+++ b/SWARD/Exam preparation/For Architecture.docx
@@ -54,15 +54,10 @@
     </w:p>
     <w:p>
       <w:pPr>
-        <w:jc w:val="center"/>
-        <w:rPr>
-          <w:b/>
-          <w:bCs/>
-          <w:color w:val="FF0000"/>
-          <w:sz w:val="28"/>
-          <w:szCs w:val="28"/>
-          <w:u w:val="single"/>
-          <w:lang w:val="en-US"/>
+        <w:rPr>
+          <w:b/>
+          <w:bCs/>
+          <w:color w:val="000000" w:themeColor="text1"/>
         </w:rPr>
       </w:pPr>
     </w:p>
@@ -86,6 +81,8 @@
     <w:p>
       <w:pPr>
         <w:rPr>
+          <w:b/>
+          <w:bCs/>
           <w:color w:val="000000" w:themeColor="text1"/>
         </w:rPr>
       </w:pPr>
@@ -102,68 +99,70 @@
       <w:pPr>
         <w:numPr>
           <w:ilvl w:val="0"/>
-          <w:numId w:val="1"/>
+          <w:numId w:val="11"/>
         </w:numPr>
         <w:rPr>
-          <w:color w:val="000000" w:themeColor="text1"/>
-        </w:rPr>
-      </w:pPr>
-      <w:r>
-        <w:rPr>
-          <w:color w:val="000000" w:themeColor="text1"/>
-        </w:rPr>
-        <w:t>Simple to develop and deploy</w:t>
-      </w:r>
-      <w:r>
-        <w:rPr>
-          <w:color w:val="000000" w:themeColor="text1"/>
-        </w:rPr>
-        <w:t xml:space="preserve">, </w:t>
-      </w:r>
-      <w:r>
-        <w:rPr>
-          <w:color w:val="000000" w:themeColor="text1"/>
-        </w:rPr>
-        <w:t xml:space="preserve">Low initial complexity. </w:t>
+          <w:b/>
+          <w:bCs/>
+          <w:color w:val="000000" w:themeColor="text1"/>
+        </w:rPr>
+      </w:pPr>
+      <w:r>
+        <w:rPr>
+          <w:b/>
+          <w:bCs/>
+          <w:color w:val="000000" w:themeColor="text1"/>
+        </w:rPr>
+        <w:t>Simple to develop and deploy; low initial complexity.</w:t>
       </w:r>
     </w:p>
     <w:p>
       <w:pPr>
         <w:numPr>
           <w:ilvl w:val="0"/>
-          <w:numId w:val="1"/>
+          <w:numId w:val="11"/>
         </w:numPr>
         <w:rPr>
-          <w:color w:val="000000" w:themeColor="text1"/>
-        </w:rPr>
-      </w:pPr>
-      <w:r>
-        <w:rPr>
-          <w:color w:val="000000" w:themeColor="text1"/>
-        </w:rPr>
-        <w:t xml:space="preserve">Easy testing and debugging. </w:t>
+          <w:b/>
+          <w:bCs/>
+          <w:color w:val="000000" w:themeColor="text1"/>
+        </w:rPr>
+      </w:pPr>
+      <w:r>
+        <w:rPr>
+          <w:b/>
+          <w:bCs/>
+          <w:color w:val="000000" w:themeColor="text1"/>
+        </w:rPr>
+        <w:t>Easy testing and debugging.</w:t>
       </w:r>
     </w:p>
     <w:p>
       <w:pPr>
         <w:numPr>
           <w:ilvl w:val="0"/>
-          <w:numId w:val="1"/>
+          <w:numId w:val="11"/>
         </w:numPr>
         <w:rPr>
-          <w:color w:val="000000" w:themeColor="text1"/>
-        </w:rPr>
-      </w:pPr>
-      <w:r>
-        <w:rPr>
-          <w:color w:val="000000" w:themeColor="text1"/>
-        </w:rPr>
-        <w:t xml:space="preserve">Good performance (no internal network communication). </w:t>
-      </w:r>
-    </w:p>
-    <w:p>
-      <w:pPr>
-        <w:rPr>
+          <w:b/>
+          <w:bCs/>
+          <w:color w:val="000000" w:themeColor="text1"/>
+        </w:rPr>
+      </w:pPr>
+      <w:r>
+        <w:rPr>
+          <w:b/>
+          <w:bCs/>
+          <w:color w:val="000000" w:themeColor="text1"/>
+        </w:rPr>
+        <w:t>Good performance (no internal network communication).</w:t>
+      </w:r>
+    </w:p>
+    <w:p>
+      <w:pPr>
+        <w:rPr>
+          <w:b/>
+          <w:bCs/>
           <w:color w:val="000000" w:themeColor="text1"/>
         </w:rPr>
       </w:pPr>
@@ -180,87 +179,202 @@
       <w:pPr>
         <w:numPr>
           <w:ilvl w:val="0"/>
-          <w:numId w:val="2"/>
+          <w:numId w:val="12"/>
         </w:numPr>
         <w:rPr>
-          <w:color w:val="000000" w:themeColor="text1"/>
-        </w:rPr>
-      </w:pPr>
-      <w:r>
-        <w:rPr>
-          <w:color w:val="000000" w:themeColor="text1"/>
-        </w:rPr>
-        <w:t xml:space="preserve">Hard to scale specific parts. </w:t>
-      </w:r>
-      <w:r>
-        <w:rPr>
-          <w:color w:val="000000" w:themeColor="text1"/>
-        </w:rPr>
-        <w:t xml:space="preserve"> (performance attribute related to capacity)</w:t>
+          <w:b/>
+          <w:bCs/>
+          <w:color w:val="000000" w:themeColor="text1"/>
+        </w:rPr>
+      </w:pPr>
+      <w:r>
+        <w:rPr>
+          <w:b/>
+          <w:bCs/>
+          <w:color w:val="000000" w:themeColor="text1"/>
+        </w:rPr>
+        <w:t>Hard to scale specific parts (capacity/performance limitation).</w:t>
       </w:r>
     </w:p>
     <w:p>
       <w:pPr>
         <w:numPr>
           <w:ilvl w:val="0"/>
-          <w:numId w:val="2"/>
+          <w:numId w:val="12"/>
         </w:numPr>
         <w:rPr>
-          <w:color w:val="000000" w:themeColor="text1"/>
-        </w:rPr>
-      </w:pPr>
-      <w:r>
-        <w:rPr>
-          <w:color w:val="000000" w:themeColor="text1"/>
-        </w:rPr>
-        <w:t xml:space="preserve">Large codebase becomes difficult to maintain. </w:t>
+          <w:b/>
+          <w:bCs/>
+          <w:color w:val="000000" w:themeColor="text1"/>
+        </w:rPr>
+      </w:pPr>
+      <w:r>
+        <w:rPr>
+          <w:b/>
+          <w:bCs/>
+          <w:color w:val="000000" w:themeColor="text1"/>
+        </w:rPr>
+        <w:t>Large codebase becomes difficult to maintain.</w:t>
       </w:r>
     </w:p>
     <w:p>
       <w:pPr>
         <w:numPr>
           <w:ilvl w:val="0"/>
-          <w:numId w:val="2"/>
+          <w:numId w:val="12"/>
         </w:numPr>
         <w:rPr>
-          <w:color w:val="000000" w:themeColor="text1"/>
-        </w:rPr>
-      </w:pPr>
-      <w:r>
-        <w:rPr>
-          <w:color w:val="000000" w:themeColor="text1"/>
-        </w:rPr>
-        <w:t xml:space="preserve">Tight coupling between components. </w:t>
+          <w:b/>
+          <w:bCs/>
+          <w:color w:val="000000" w:themeColor="text1"/>
+        </w:rPr>
+      </w:pPr>
+      <w:r>
+        <w:rPr>
+          <w:b/>
+          <w:bCs/>
+          <w:color w:val="000000" w:themeColor="text1"/>
+        </w:rPr>
+        <w:t>Tight coupling between components.</w:t>
       </w:r>
     </w:p>
     <w:p>
       <w:pPr>
         <w:numPr>
           <w:ilvl w:val="0"/>
-          <w:numId w:val="2"/>
+          <w:numId w:val="12"/>
         </w:numPr>
         <w:rPr>
-          <w:color w:val="000000" w:themeColor="text1"/>
-        </w:rPr>
-      </w:pPr>
-      <w:r>
-        <w:rPr>
-          <w:color w:val="000000" w:themeColor="text1"/>
-        </w:rPr>
-        <w:t xml:space="preserve">Entire system affected by failures. </w:t>
-      </w:r>
-    </w:p>
-    <w:p>
-      <w:pPr>
-        <w:rPr>
-          <w:color w:val="000000" w:themeColor="text1"/>
-        </w:rPr>
-      </w:pPr>
-      <w:r>
-        <w:rPr>
-          <w:color w:val="000000" w:themeColor="text1"/>
-        </w:rPr>
-        <w:pict w14:anchorId="4C7229D9">
+          <w:b/>
+          <w:bCs/>
+          <w:color w:val="000000" w:themeColor="text1"/>
+        </w:rPr>
+      </w:pPr>
+      <w:r>
+        <w:rPr>
+          <w:b/>
+          <w:bCs/>
+          <w:color w:val="000000" w:themeColor="text1"/>
+        </w:rPr>
+        <w:t>Entire system affected by failures.</w:t>
+      </w:r>
+    </w:p>
+    <w:p>
+      <w:pPr>
+        <w:rPr>
+          <w:b/>
+          <w:bCs/>
+          <w:color w:val="000000" w:themeColor="text1"/>
+        </w:rPr>
+      </w:pPr>
+      <w:r>
+        <w:rPr>
+          <w:b/>
+          <w:bCs/>
+          <w:color w:val="000000" w:themeColor="text1"/>
+        </w:rPr>
+        <w:t>Risks</w:t>
+      </w:r>
+    </w:p>
+    <w:p>
+      <w:pPr>
+        <w:numPr>
+          <w:ilvl w:val="0"/>
+          <w:numId w:val="13"/>
+        </w:numPr>
+        <w:rPr>
+          <w:b/>
+          <w:bCs/>
+          <w:color w:val="000000" w:themeColor="text1"/>
+        </w:rPr>
+      </w:pPr>
+      <w:r>
+        <w:rPr>
+          <w:b/>
+          <w:bCs/>
+          <w:color w:val="000000" w:themeColor="text1"/>
+        </w:rPr>
+        <w:t>A single defect can cause the entire application to become unavailable.</w:t>
+      </w:r>
+    </w:p>
+    <w:p>
+      <w:pPr>
+        <w:numPr>
+          <w:ilvl w:val="0"/>
+          <w:numId w:val="13"/>
+        </w:numPr>
+        <w:rPr>
+          <w:b/>
+          <w:bCs/>
+          <w:color w:val="000000" w:themeColor="text1"/>
+        </w:rPr>
+      </w:pPr>
+      <w:r>
+        <w:rPr>
+          <w:b/>
+          <w:bCs/>
+          <w:color w:val="000000" w:themeColor="text1"/>
+        </w:rPr>
+        <w:t>Increasing technical debt can slow future development and maintenance.</w:t>
+      </w:r>
+    </w:p>
+    <w:p>
+      <w:pPr>
+        <w:numPr>
+          <w:ilvl w:val="0"/>
+          <w:numId w:val="13"/>
+        </w:numPr>
+        <w:rPr>
+          <w:b/>
+          <w:bCs/>
+          <w:color w:val="000000" w:themeColor="text1"/>
+        </w:rPr>
+      </w:pPr>
+      <w:r>
+        <w:rPr>
+          <w:b/>
+          <w:bCs/>
+          <w:color w:val="000000" w:themeColor="text1"/>
+        </w:rPr>
+        <w:t>Difficult upgrades may introduce regressions across unrelated features.</w:t>
+      </w:r>
+    </w:p>
+    <w:p>
+      <w:pPr>
+        <w:numPr>
+          <w:ilvl w:val="0"/>
+          <w:numId w:val="13"/>
+        </w:numPr>
+        <w:rPr>
+          <w:b/>
+          <w:bCs/>
+          <w:color w:val="000000" w:themeColor="text1"/>
+        </w:rPr>
+      </w:pPr>
+      <w:r>
+        <w:rPr>
+          <w:b/>
+          <w:bCs/>
+          <w:color w:val="000000" w:themeColor="text1"/>
+        </w:rPr>
+        <w:t>Scaling the whole application instead of individual components can increase infrastructure costs.</w:t>
+      </w:r>
+    </w:p>
+    <w:p>
+      <w:pPr>
+        <w:rPr>
+          <w:b/>
+          <w:bCs/>
+          <w:color w:val="000000" w:themeColor="text1"/>
+        </w:rPr>
+      </w:pPr>
+      <w:r>
+        <w:rPr>
+          <w:b/>
+          <w:bCs/>
+          <w:color w:val="000000" w:themeColor="text1"/>
+        </w:rPr>
+        <w:pict w14:anchorId="1167F13E">
           <v:rect id="_x0000_i1025" style="width:0;height:1.5pt" o:hralign="center" o:hrstd="t" o:hr="t" fillcolor="#a0a0a0" stroked="f"/>
         </w:pict>
       </w:r>
@@ -285,6 +399,8 @@
     <w:p>
       <w:pPr>
         <w:rPr>
+          <w:b/>
+          <w:bCs/>
           <w:color w:val="000000" w:themeColor="text1"/>
         </w:rPr>
       </w:pPr>
@@ -301,73 +417,91 @@
       <w:pPr>
         <w:numPr>
           <w:ilvl w:val="0"/>
-          <w:numId w:val="3"/>
+          <w:numId w:val="14"/>
         </w:numPr>
         <w:rPr>
-          <w:color w:val="000000" w:themeColor="text1"/>
-        </w:rPr>
-      </w:pPr>
-      <w:r>
-        <w:rPr>
-          <w:color w:val="000000" w:themeColor="text1"/>
-        </w:rPr>
-        <w:t xml:space="preserve">Separation of concerns. </w:t>
+          <w:b/>
+          <w:bCs/>
+          <w:color w:val="000000" w:themeColor="text1"/>
+        </w:rPr>
+      </w:pPr>
+      <w:r>
+        <w:rPr>
+          <w:b/>
+          <w:bCs/>
+          <w:color w:val="000000" w:themeColor="text1"/>
+        </w:rPr>
+        <w:t>Separation of concerns.</w:t>
       </w:r>
     </w:p>
     <w:p>
       <w:pPr>
         <w:numPr>
           <w:ilvl w:val="0"/>
-          <w:numId w:val="3"/>
+          <w:numId w:val="14"/>
         </w:numPr>
         <w:rPr>
-          <w:color w:val="000000" w:themeColor="text1"/>
-        </w:rPr>
-      </w:pPr>
-      <w:r>
-        <w:rPr>
-          <w:color w:val="000000" w:themeColor="text1"/>
-        </w:rPr>
-        <w:t xml:space="preserve">Easier maintenance and modification. </w:t>
+          <w:b/>
+          <w:bCs/>
+          <w:color w:val="000000" w:themeColor="text1"/>
+        </w:rPr>
+      </w:pPr>
+      <w:r>
+        <w:rPr>
+          <w:b/>
+          <w:bCs/>
+          <w:color w:val="000000" w:themeColor="text1"/>
+        </w:rPr>
+        <w:t>Easier maintenance and modification.</w:t>
       </w:r>
     </w:p>
     <w:p>
       <w:pPr>
         <w:numPr>
           <w:ilvl w:val="0"/>
-          <w:numId w:val="3"/>
+          <w:numId w:val="14"/>
         </w:numPr>
         <w:rPr>
-          <w:color w:val="000000" w:themeColor="text1"/>
-        </w:rPr>
-      </w:pPr>
-      <w:r>
-        <w:rPr>
-          <w:color w:val="000000" w:themeColor="text1"/>
-        </w:rPr>
-        <w:t xml:space="preserve">Layers can be scaled independently. </w:t>
+          <w:b/>
+          <w:bCs/>
+          <w:color w:val="000000" w:themeColor="text1"/>
+        </w:rPr>
+      </w:pPr>
+      <w:r>
+        <w:rPr>
+          <w:b/>
+          <w:bCs/>
+          <w:color w:val="000000" w:themeColor="text1"/>
+        </w:rPr>
+        <w:t>Layers can be scaled independently.</w:t>
       </w:r>
     </w:p>
     <w:p>
       <w:pPr>
         <w:numPr>
           <w:ilvl w:val="0"/>
-          <w:numId w:val="3"/>
+          <w:numId w:val="14"/>
         </w:numPr>
         <w:rPr>
-          <w:color w:val="000000" w:themeColor="text1"/>
-        </w:rPr>
-      </w:pPr>
-      <w:r>
-        <w:rPr>
-          <w:color w:val="000000" w:themeColor="text1"/>
-        </w:rPr>
-        <w:t xml:space="preserve">Better security through layer isolation. </w:t>
-      </w:r>
-    </w:p>
-    <w:p>
-      <w:pPr>
-        <w:rPr>
+          <w:b/>
+          <w:bCs/>
+          <w:color w:val="000000" w:themeColor="text1"/>
+        </w:rPr>
+      </w:pPr>
+      <w:r>
+        <w:rPr>
+          <w:b/>
+          <w:bCs/>
+          <w:color w:val="000000" w:themeColor="text1"/>
+        </w:rPr>
+        <w:t>Better security through layer isolation.</w:t>
+      </w:r>
+    </w:p>
+    <w:p>
+      <w:pPr>
+        <w:rPr>
+          <w:b/>
+          <w:bCs/>
           <w:color w:val="000000" w:themeColor="text1"/>
         </w:rPr>
       </w:pPr>
@@ -384,81 +518,161 @@
       <w:pPr>
         <w:numPr>
           <w:ilvl w:val="0"/>
-          <w:numId w:val="4"/>
+          <w:numId w:val="15"/>
         </w:numPr>
         <w:rPr>
-          <w:color w:val="000000" w:themeColor="text1"/>
-        </w:rPr>
-      </w:pPr>
-      <w:r>
-        <w:rPr>
-          <w:color w:val="000000" w:themeColor="text1"/>
-        </w:rPr>
-        <w:t xml:space="preserve">More complex than monolith. </w:t>
+          <w:b/>
+          <w:bCs/>
+          <w:color w:val="000000" w:themeColor="text1"/>
+        </w:rPr>
+      </w:pPr>
+      <w:r>
+        <w:rPr>
+          <w:b/>
+          <w:bCs/>
+          <w:color w:val="000000" w:themeColor="text1"/>
+        </w:rPr>
+        <w:t>More complex than a monolith.</w:t>
       </w:r>
     </w:p>
     <w:p>
       <w:pPr>
         <w:numPr>
           <w:ilvl w:val="0"/>
-          <w:numId w:val="4"/>
+          <w:numId w:val="15"/>
         </w:numPr>
         <w:rPr>
-          <w:color w:val="000000" w:themeColor="text1"/>
-        </w:rPr>
-      </w:pPr>
-      <w:r>
-        <w:rPr>
-          <w:color w:val="000000" w:themeColor="text1"/>
-        </w:rPr>
-        <w:t xml:space="preserve">Possible performance overhead between layers. </w:t>
+          <w:b/>
+          <w:bCs/>
+          <w:color w:val="000000" w:themeColor="text1"/>
+        </w:rPr>
+      </w:pPr>
+      <w:r>
+        <w:rPr>
+          <w:b/>
+          <w:bCs/>
+          <w:color w:val="000000" w:themeColor="text1"/>
+        </w:rPr>
+        <w:t>Possible performance overhead between layers.</w:t>
       </w:r>
     </w:p>
     <w:p>
       <w:pPr>
         <w:numPr>
           <w:ilvl w:val="0"/>
-          <w:numId w:val="4"/>
+          <w:numId w:val="15"/>
         </w:numPr>
         <w:rPr>
-          <w:color w:val="000000" w:themeColor="text1"/>
-        </w:rPr>
-      </w:pPr>
-      <w:r>
-        <w:rPr>
-          <w:color w:val="000000" w:themeColor="text1"/>
-        </w:rPr>
-        <w:t xml:space="preserve">More components to manage. </w:t>
+          <w:b/>
+          <w:bCs/>
+          <w:color w:val="000000" w:themeColor="text1"/>
+        </w:rPr>
+      </w:pPr>
+      <w:r>
+        <w:rPr>
+          <w:b/>
+          <w:bCs/>
+          <w:color w:val="000000" w:themeColor="text1"/>
+        </w:rPr>
+        <w:t>More components to manage.</w:t>
       </w:r>
     </w:p>
     <w:p>
       <w:pPr>
         <w:numPr>
           <w:ilvl w:val="0"/>
-          <w:numId w:val="4"/>
+          <w:numId w:val="15"/>
         </w:numPr>
         <w:rPr>
-          <w:color w:val="000000" w:themeColor="text1"/>
-        </w:rPr>
-      </w:pPr>
-      <w:r>
-        <w:rPr>
-          <w:color w:val="000000" w:themeColor="text1"/>
-        </w:rPr>
-        <w:t xml:space="preserve">Debugging can be harder. </w:t>
-      </w:r>
-    </w:p>
-    <w:p>
-      <w:pPr>
-        <w:rPr>
-          <w:color w:val="000000" w:themeColor="text1"/>
-        </w:rPr>
-      </w:pPr>
-      <w:r>
-        <w:rPr>
-          <w:color w:val="000000" w:themeColor="text1"/>
-        </w:rPr>
-        <w:pict w14:anchorId="1C64ADBA">
+          <w:b/>
+          <w:bCs/>
+          <w:color w:val="000000" w:themeColor="text1"/>
+        </w:rPr>
+      </w:pPr>
+      <w:r>
+        <w:rPr>
+          <w:b/>
+          <w:bCs/>
+          <w:color w:val="000000" w:themeColor="text1"/>
+        </w:rPr>
+        <w:t>Debugging can be harder.</w:t>
+      </w:r>
+    </w:p>
+    <w:p>
+      <w:pPr>
+        <w:rPr>
+          <w:b/>
+          <w:bCs/>
+          <w:color w:val="000000" w:themeColor="text1"/>
+        </w:rPr>
+      </w:pPr>
+      <w:r>
+        <w:rPr>
+          <w:b/>
+          <w:bCs/>
+          <w:color w:val="000000" w:themeColor="text1"/>
+        </w:rPr>
+        <w:t>Risks</w:t>
+      </w:r>
+    </w:p>
+    <w:p>
+      <w:pPr>
+        <w:numPr>
+          <w:ilvl w:val="0"/>
+          <w:numId w:val="16"/>
+        </w:numPr>
+        <w:rPr>
+          <w:b/>
+          <w:bCs/>
+          <w:color w:val="000000" w:themeColor="text1"/>
+        </w:rPr>
+      </w:pPr>
+      <w:r>
+        <w:rPr>
+          <w:b/>
+          <w:bCs/>
+          <w:color w:val="000000" w:themeColor="text1"/>
+        </w:rPr>
+        <w:t>A failure in one layer may affect dependent layers.</w:t>
+      </w:r>
+    </w:p>
+    <w:p>
+      <w:pPr>
+        <w:numPr>
+          <w:ilvl w:val="0"/>
+          <w:numId w:val="16"/>
+        </w:numPr>
+        <w:rPr>
+          <w:b/>
+          <w:bCs/>
+          <w:color w:val="000000" w:themeColor="text1"/>
+        </w:rPr>
+      </w:pPr>
+      <w:r>
+        <w:rPr>
+          <w:b/>
+          <w:bCs/>
+          <w:color w:val="000000" w:themeColor="text1"/>
+        </w:rPr>
+        <w:lastRenderedPageBreak/>
+        <w:t>Increased architectural complexity may lead to higher development and operational costs.</w:t>
+      </w:r>
+    </w:p>
+    <w:p>
+      <w:pPr>
+        <w:rPr>
+          <w:b/>
+          <w:bCs/>
+          <w:color w:val="000000" w:themeColor="text1"/>
+        </w:rPr>
+      </w:pPr>
+      <w:r>
+        <w:rPr>
+          <w:b/>
+          <w:bCs/>
+          <w:color w:val="000000" w:themeColor="text1"/>
+        </w:rPr>
+        <w:pict w14:anchorId="5B9E8DC5">
           <v:rect id="_x0000_i1026" style="width:0;height:1.5pt" o:hralign="center" o:hrstd="t" o:hr="t" fillcolor="#a0a0a0" stroked="f"/>
         </w:pict>
       </w:r>
@@ -471,15 +685,6 @@
           <w:color w:val="000000" w:themeColor="text1"/>
         </w:rPr>
       </w:pPr>
-    </w:p>
-    <w:p>
-      <w:pPr>
-        <w:rPr>
-          <w:b/>
-          <w:bCs/>
-          <w:color w:val="000000" w:themeColor="text1"/>
-        </w:rPr>
-      </w:pPr>
       <w:r>
         <w:rPr>
           <w:b/>
@@ -492,6 +697,8 @@
     <w:p>
       <w:pPr>
         <w:rPr>
+          <w:b/>
+          <w:bCs/>
           <w:color w:val="000000" w:themeColor="text1"/>
         </w:rPr>
       </w:pPr>
@@ -508,74 +715,91 @@
       <w:pPr>
         <w:numPr>
           <w:ilvl w:val="0"/>
-          <w:numId w:val="5"/>
+          <w:numId w:val="17"/>
         </w:numPr>
         <w:rPr>
-          <w:color w:val="000000" w:themeColor="text1"/>
-        </w:rPr>
-      </w:pPr>
-      <w:r>
-        <w:rPr>
-          <w:color w:val="000000" w:themeColor="text1"/>
-        </w:rPr>
-        <w:t xml:space="preserve">Services can be developed and deployed independently. </w:t>
+          <w:b/>
+          <w:bCs/>
+          <w:color w:val="000000" w:themeColor="text1"/>
+        </w:rPr>
+      </w:pPr>
+      <w:r>
+        <w:rPr>
+          <w:b/>
+          <w:bCs/>
+          <w:color w:val="000000" w:themeColor="text1"/>
+        </w:rPr>
+        <w:t>Services can be developed and deployed independently.</w:t>
       </w:r>
     </w:p>
     <w:p>
       <w:pPr>
         <w:numPr>
           <w:ilvl w:val="0"/>
-          <w:numId w:val="5"/>
+          <w:numId w:val="17"/>
         </w:numPr>
         <w:rPr>
-          <w:color w:val="000000" w:themeColor="text1"/>
-        </w:rPr>
-      </w:pPr>
-      <w:r>
-        <w:rPr>
-          <w:color w:val="000000" w:themeColor="text1"/>
-        </w:rPr>
-        <w:t xml:space="preserve">Independent scaling of services. </w:t>
+          <w:b/>
+          <w:bCs/>
+          <w:color w:val="000000" w:themeColor="text1"/>
+        </w:rPr>
+      </w:pPr>
+      <w:r>
+        <w:rPr>
+          <w:b/>
+          <w:bCs/>
+          <w:color w:val="000000" w:themeColor="text1"/>
+        </w:rPr>
+        <w:t>Independent scaling of services.</w:t>
       </w:r>
     </w:p>
     <w:p>
       <w:pPr>
         <w:numPr>
           <w:ilvl w:val="0"/>
-          <w:numId w:val="5"/>
+          <w:numId w:val="17"/>
         </w:numPr>
         <w:rPr>
-          <w:color w:val="000000" w:themeColor="text1"/>
-        </w:rPr>
-      </w:pPr>
-      <w:r>
-        <w:rPr>
-          <w:color w:val="000000" w:themeColor="text1"/>
-        </w:rPr>
-        <w:t xml:space="preserve">High reusability of services. </w:t>
+          <w:b/>
+          <w:bCs/>
+          <w:color w:val="000000" w:themeColor="text1"/>
+        </w:rPr>
+      </w:pPr>
+      <w:r>
+        <w:rPr>
+          <w:b/>
+          <w:bCs/>
+          <w:color w:val="000000" w:themeColor="text1"/>
+        </w:rPr>
+        <w:t>High reusability of services.</w:t>
       </w:r>
     </w:p>
     <w:p>
       <w:pPr>
         <w:numPr>
           <w:ilvl w:val="0"/>
-          <w:numId w:val="5"/>
+          <w:numId w:val="17"/>
         </w:numPr>
         <w:rPr>
-          <w:color w:val="000000" w:themeColor="text1"/>
-        </w:rPr>
-      </w:pPr>
-      <w:r>
-        <w:rPr>
-          <w:color w:val="000000" w:themeColor="text1"/>
-        </w:rPr>
-        <w:lastRenderedPageBreak/>
-        <w:t xml:space="preserve">Better fault isolation. </w:t>
-      </w:r>
-    </w:p>
-    <w:p>
-      <w:pPr>
-        <w:rPr>
+          <w:b/>
+          <w:bCs/>
+          <w:color w:val="000000" w:themeColor="text1"/>
+        </w:rPr>
+      </w:pPr>
+      <w:r>
+        <w:rPr>
+          <w:b/>
+          <w:bCs/>
+          <w:color w:val="000000" w:themeColor="text1"/>
+        </w:rPr>
+        <w:t>Better fault isolation.</w:t>
+      </w:r>
+    </w:p>
+    <w:p>
+      <w:pPr>
+        <w:rPr>
+          <w:b/>
+          <w:bCs/>
           <w:color w:val="000000" w:themeColor="text1"/>
         </w:rPr>
       </w:pPr>
@@ -592,85 +816,221 @@
       <w:pPr>
         <w:numPr>
           <w:ilvl w:val="0"/>
-          <w:numId w:val="6"/>
+          <w:numId w:val="18"/>
         </w:numPr>
         <w:rPr>
-          <w:color w:val="000000" w:themeColor="text1"/>
-        </w:rPr>
-      </w:pPr>
-      <w:r>
-        <w:rPr>
-          <w:color w:val="000000" w:themeColor="text1"/>
-        </w:rPr>
-        <w:t xml:space="preserve">Higher complexity. </w:t>
+          <w:b/>
+          <w:bCs/>
+          <w:color w:val="000000" w:themeColor="text1"/>
+        </w:rPr>
+      </w:pPr>
+      <w:r>
+        <w:rPr>
+          <w:b/>
+          <w:bCs/>
+          <w:color w:val="000000" w:themeColor="text1"/>
+        </w:rPr>
+        <w:t>Higher complexity.</w:t>
       </w:r>
     </w:p>
     <w:p>
       <w:pPr>
         <w:numPr>
           <w:ilvl w:val="0"/>
-          <w:numId w:val="6"/>
+          <w:numId w:val="18"/>
         </w:numPr>
         <w:rPr>
-          <w:color w:val="000000" w:themeColor="text1"/>
-        </w:rPr>
-      </w:pPr>
-      <w:r>
-        <w:rPr>
-          <w:color w:val="000000" w:themeColor="text1"/>
-        </w:rPr>
-        <w:t xml:space="preserve">Network communication adds latency. </w:t>
+          <w:b/>
+          <w:bCs/>
+          <w:color w:val="000000" w:themeColor="text1"/>
+        </w:rPr>
+      </w:pPr>
+      <w:r>
+        <w:rPr>
+          <w:b/>
+          <w:bCs/>
+          <w:color w:val="000000" w:themeColor="text1"/>
+        </w:rPr>
+        <w:t>Network communication adds latency.</w:t>
       </w:r>
     </w:p>
     <w:p>
       <w:pPr>
         <w:numPr>
           <w:ilvl w:val="0"/>
-          <w:numId w:val="6"/>
+          <w:numId w:val="18"/>
         </w:numPr>
         <w:rPr>
-          <w:color w:val="000000" w:themeColor="text1"/>
-        </w:rPr>
-      </w:pPr>
-      <w:r>
-        <w:rPr>
-          <w:color w:val="000000" w:themeColor="text1"/>
-        </w:rPr>
-        <w:t xml:space="preserve">Harder data consistency management. </w:t>
+          <w:b/>
+          <w:bCs/>
+          <w:color w:val="000000" w:themeColor="text1"/>
+        </w:rPr>
+      </w:pPr>
+      <w:r>
+        <w:rPr>
+          <w:b/>
+          <w:bCs/>
+          <w:color w:val="000000" w:themeColor="text1"/>
+        </w:rPr>
+        <w:t>Harder data consistency management.</w:t>
       </w:r>
     </w:p>
     <w:p>
       <w:pPr>
         <w:numPr>
           <w:ilvl w:val="0"/>
-          <w:numId w:val="6"/>
+          <w:numId w:val="18"/>
         </w:numPr>
         <w:rPr>
-          <w:color w:val="000000" w:themeColor="text1"/>
-        </w:rPr>
-      </w:pPr>
-      <w:r>
-        <w:rPr>
-          <w:color w:val="000000" w:themeColor="text1"/>
-        </w:rPr>
-        <w:t xml:space="preserve">Requires strong monitoring and infrastructure. </w:t>
-      </w:r>
-    </w:p>
-    <w:p>
-      <w:pPr>
-        <w:rPr>
-          <w:b/>
-          <w:bCs/>
-          <w:color w:val="000000" w:themeColor="text1"/>
-        </w:rPr>
-      </w:pPr>
-      <w:r>
-        <w:rPr>
-          <w:b/>
-          <w:bCs/>
-          <w:color w:val="000000" w:themeColor="text1"/>
-        </w:rPr>
-        <w:t>Client-Server Architecture</w:t>
+          <w:b/>
+          <w:bCs/>
+          <w:color w:val="000000" w:themeColor="text1"/>
+        </w:rPr>
+      </w:pPr>
+      <w:r>
+        <w:rPr>
+          <w:b/>
+          <w:bCs/>
+          <w:color w:val="000000" w:themeColor="text1"/>
+        </w:rPr>
+        <w:t>Requires strong monitoring and infrastructure.</w:t>
+      </w:r>
+    </w:p>
+    <w:p>
+      <w:pPr>
+        <w:rPr>
+          <w:b/>
+          <w:bCs/>
+          <w:color w:val="000000" w:themeColor="text1"/>
+        </w:rPr>
+      </w:pPr>
+      <w:r>
+        <w:rPr>
+          <w:b/>
+          <w:bCs/>
+          <w:color w:val="000000" w:themeColor="text1"/>
+        </w:rPr>
+        <w:t>Risks</w:t>
+      </w:r>
+    </w:p>
+    <w:p>
+      <w:pPr>
+        <w:numPr>
+          <w:ilvl w:val="0"/>
+          <w:numId w:val="19"/>
+        </w:numPr>
+        <w:rPr>
+          <w:b/>
+          <w:bCs/>
+          <w:color w:val="000000" w:themeColor="text1"/>
+        </w:rPr>
+      </w:pPr>
+      <w:r>
+        <w:rPr>
+          <w:b/>
+          <w:bCs/>
+          <w:color w:val="000000" w:themeColor="text1"/>
+        </w:rPr>
+        <w:t>Service communication failures can interrupt business processes.</w:t>
+      </w:r>
+    </w:p>
+    <w:p>
+      <w:pPr>
+        <w:numPr>
+          <w:ilvl w:val="0"/>
+          <w:numId w:val="19"/>
+        </w:numPr>
+        <w:rPr>
+          <w:b/>
+          <w:bCs/>
+          <w:color w:val="000000" w:themeColor="text1"/>
+        </w:rPr>
+      </w:pPr>
+      <w:r>
+        <w:rPr>
+          <w:b/>
+          <w:bCs/>
+          <w:color w:val="000000" w:themeColor="text1"/>
+        </w:rPr>
+        <w:t>Distributed transactions may result in inconsistent data.</w:t>
+      </w:r>
+    </w:p>
+    <w:p>
+      <w:pPr>
+        <w:numPr>
+          <w:ilvl w:val="0"/>
+          <w:numId w:val="19"/>
+        </w:numPr>
+        <w:rPr>
+          <w:b/>
+          <w:bCs/>
+          <w:color w:val="000000" w:themeColor="text1"/>
+        </w:rPr>
+      </w:pPr>
+      <w:r>
+        <w:rPr>
+          <w:b/>
+          <w:bCs/>
+          <w:color w:val="000000" w:themeColor="text1"/>
+        </w:rPr>
+        <w:t>Weak service governance can lead to duplicated or incompatible services.</w:t>
+      </w:r>
+    </w:p>
+    <w:p>
+      <w:pPr>
+        <w:numPr>
+          <w:ilvl w:val="0"/>
+          <w:numId w:val="19"/>
+        </w:numPr>
+        <w:rPr>
+          <w:b/>
+          <w:bCs/>
+          <w:color w:val="000000" w:themeColor="text1"/>
+        </w:rPr>
+      </w:pPr>
+      <w:r>
+        <w:rPr>
+          <w:b/>
+          <w:bCs/>
+          <w:color w:val="000000" w:themeColor="text1"/>
+        </w:rPr>
+        <w:t>Increased attack surface due to multiple exposed service endpoints.</w:t>
+      </w:r>
+    </w:p>
+    <w:p>
+      <w:pPr>
+        <w:rPr>
+          <w:b/>
+          <w:bCs/>
+          <w:color w:val="000000" w:themeColor="text1"/>
+        </w:rPr>
+      </w:pPr>
+      <w:r>
+        <w:rPr>
+          <w:b/>
+          <w:bCs/>
+          <w:color w:val="000000" w:themeColor="text1"/>
+        </w:rPr>
+        <w:pict w14:anchorId="6CB1ABE2">
+          <v:rect id="_x0000_i1027" style="width:0;height:1.5pt" o:hralign="center" o:hrstd="t" o:hr="t" fillcolor="#a0a0a0" stroked="f"/>
+        </w:pict>
+      </w:r>
+    </w:p>
+    <w:p>
+      <w:pPr>
+        <w:rPr>
+          <w:b/>
+          <w:bCs/>
+          <w:color w:val="000000" w:themeColor="text1"/>
+        </w:rPr>
+      </w:pPr>
+      <w:r>
+        <w:rPr>
+          <w:b/>
+          <w:bCs/>
+          <w:color w:val="000000" w:themeColor="text1"/>
+        </w:rPr>
+        <w:t>Client–Server Architecture</w:t>
       </w:r>
     </w:p>
     <w:p>
@@ -692,52 +1052,107 @@
     </w:p>
     <w:p>
       <w:pPr>
-        <w:rPr>
-          <w:b/>
-          <w:bCs/>
-          <w:color w:val="000000" w:themeColor="text1"/>
-        </w:rPr>
-      </w:pPr>
-      <w:r>
-        <w:rPr>
-          <w:color w:val="000000" w:themeColor="text1"/>
-        </w:rPr>
-        <w:t>• Centralized management and control.</w:t>
-      </w:r>
-      <w:r>
-        <w:rPr>
-          <w:color w:val="000000" w:themeColor="text1"/>
-        </w:rPr>
-        <w:br/>
-        <w:t>• Easier security management because authentication, authorization, and data access can be controlled centrally.</w:t>
-      </w:r>
-      <w:r>
-        <w:rPr>
-          <w:color w:val="000000" w:themeColor="text1"/>
-        </w:rPr>
-        <w:br/>
-        <w:t>• Simpler maintenance and updates since changes can be applied mainly on the server side.</w:t>
-      </w:r>
-      <w:r>
-        <w:rPr>
-          <w:color w:val="000000" w:themeColor="text1"/>
-        </w:rPr>
-        <w:br/>
-        <w:t>• Consistent data management because data is stored and controlled by a central server.</w:t>
-      </w:r>
-      <w:r>
-        <w:rPr>
-          <w:color w:val="000000" w:themeColor="text1"/>
-        </w:rPr>
-        <w:br/>
-      </w:r>
-      <w:r>
-        <w:rPr>
-          <w:b/>
-          <w:bCs/>
-          <w:color w:val="000000" w:themeColor="text1"/>
-        </w:rPr>
-        <w:t>• Efficient resource sharing among multiple clients.</w:t>
+        <w:numPr>
+          <w:ilvl w:val="0"/>
+          <w:numId w:val="20"/>
+        </w:numPr>
+        <w:rPr>
+          <w:b/>
+          <w:bCs/>
+          <w:color w:val="000000" w:themeColor="text1"/>
+        </w:rPr>
+      </w:pPr>
+      <w:r>
+        <w:rPr>
+          <w:b/>
+          <w:bCs/>
+          <w:color w:val="000000" w:themeColor="text1"/>
+        </w:rPr>
+        <w:t>Centralized management and control.</w:t>
+      </w:r>
+    </w:p>
+    <w:p>
+      <w:pPr>
+        <w:numPr>
+          <w:ilvl w:val="0"/>
+          <w:numId w:val="20"/>
+        </w:numPr>
+        <w:rPr>
+          <w:b/>
+          <w:bCs/>
+          <w:color w:val="000000" w:themeColor="text1"/>
+        </w:rPr>
+      </w:pPr>
+      <w:r>
+        <w:rPr>
+          <w:b/>
+          <w:bCs/>
+          <w:color w:val="000000" w:themeColor="text1"/>
+        </w:rPr>
+        <w:t>Easier security management because authentication, authorization, and data access can be controlled centrally.</w:t>
+      </w:r>
+    </w:p>
+    <w:p>
+      <w:pPr>
+        <w:numPr>
+          <w:ilvl w:val="0"/>
+          <w:numId w:val="20"/>
+        </w:numPr>
+        <w:rPr>
+          <w:b/>
+          <w:bCs/>
+          <w:color w:val="000000" w:themeColor="text1"/>
+        </w:rPr>
+      </w:pPr>
+      <w:r>
+        <w:rPr>
+          <w:b/>
+          <w:bCs/>
+          <w:color w:val="000000" w:themeColor="text1"/>
+        </w:rPr>
+        <w:t>Simpler maintenance and updates since changes can be applied mainly on the server side.</w:t>
+      </w:r>
+    </w:p>
+    <w:p>
+      <w:pPr>
+        <w:numPr>
+          <w:ilvl w:val="0"/>
+          <w:numId w:val="20"/>
+        </w:numPr>
+        <w:rPr>
+          <w:b/>
+          <w:bCs/>
+          <w:color w:val="000000" w:themeColor="text1"/>
+        </w:rPr>
+      </w:pPr>
+      <w:r>
+        <w:rPr>
+          <w:b/>
+          <w:bCs/>
+          <w:color w:val="000000" w:themeColor="text1"/>
+        </w:rPr>
+        <w:t>Consistent data management because data is stored and controlled by a central server.</w:t>
+      </w:r>
+    </w:p>
+    <w:p>
+      <w:pPr>
+        <w:numPr>
+          <w:ilvl w:val="0"/>
+          <w:numId w:val="20"/>
+        </w:numPr>
+        <w:rPr>
+          <w:b/>
+          <w:bCs/>
+          <w:color w:val="000000" w:themeColor="text1"/>
+        </w:rPr>
+      </w:pPr>
+      <w:r>
+        <w:rPr>
+          <w:b/>
+          <w:bCs/>
+          <w:color w:val="000000" w:themeColor="text1"/>
+        </w:rPr>
+        <w:t>Efficient resource sharing among multiple clients.</w:t>
       </w:r>
     </w:p>
     <w:p>
@@ -759,57 +1174,227 @@
     </w:p>
     <w:p>
       <w:pPr>
-        <w:rPr>
-          <w:color w:val="000000" w:themeColor="text1"/>
-        </w:rPr>
-      </w:pPr>
-      <w:r>
-        <w:rPr>
-          <w:color w:val="000000" w:themeColor="text1"/>
-        </w:rPr>
-        <w:t>• Server can become a single point of failure if no redundancy is implemented.</w:t>
-      </w:r>
-      <w:r>
-        <w:rPr>
-          <w:color w:val="000000" w:themeColor="text1"/>
-        </w:rPr>
-        <w:br/>
-        <w:t>• Limited scalability because the server may become a bottleneck as the number of clients increases.</w:t>
-      </w:r>
-      <w:r>
-        <w:rPr>
-          <w:color w:val="000000" w:themeColor="text1"/>
-        </w:rPr>
-        <w:br/>
-        <w:t>• Performance depends on server capacity.</w:t>
-      </w:r>
-      <w:r>
-        <w:rPr>
-          <w:color w:val="000000" w:themeColor="text1"/>
-        </w:rPr>
-        <w:br/>
-        <w:t>• Network dependency means clients cannot function properly if the server is unavailable.</w:t>
-      </w:r>
-      <w:r>
-        <w:rPr>
-          <w:color w:val="000000" w:themeColor="text1"/>
-        </w:rPr>
-        <w:br/>
-        <w:t>• Less flexible than decentralized architectures because control is concentrated in one place.</w:t>
-      </w:r>
-    </w:p>
-    <w:p>
-      <w:pPr>
-        <w:rPr>
-          <w:color w:val="000000" w:themeColor="text1"/>
-        </w:rPr>
-      </w:pPr>
-      <w:r>
-        <w:rPr>
-          <w:color w:val="000000" w:themeColor="text1"/>
-        </w:rPr>
-        <w:pict w14:anchorId="14A7189D">
-          <v:rect id="_x0000_i1069" style="width:0;height:1.5pt" o:hralign="center" o:hrstd="t" o:hr="t" fillcolor="#a0a0a0" stroked="f"/>
+        <w:numPr>
+          <w:ilvl w:val="0"/>
+          <w:numId w:val="21"/>
+        </w:numPr>
+        <w:rPr>
+          <w:b/>
+          <w:bCs/>
+          <w:color w:val="000000" w:themeColor="text1"/>
+        </w:rPr>
+      </w:pPr>
+      <w:r>
+        <w:rPr>
+          <w:b/>
+          <w:bCs/>
+          <w:color w:val="000000" w:themeColor="text1"/>
+        </w:rPr>
+        <w:t>Server can become a single point of failure if no redundancy is implemented.</w:t>
+      </w:r>
+    </w:p>
+    <w:p>
+      <w:pPr>
+        <w:numPr>
+          <w:ilvl w:val="0"/>
+          <w:numId w:val="21"/>
+        </w:numPr>
+        <w:rPr>
+          <w:b/>
+          <w:bCs/>
+          <w:color w:val="000000" w:themeColor="text1"/>
+        </w:rPr>
+      </w:pPr>
+      <w:r>
+        <w:rPr>
+          <w:b/>
+          <w:bCs/>
+          <w:color w:val="000000" w:themeColor="text1"/>
+        </w:rPr>
+        <w:lastRenderedPageBreak/>
+        <w:t>Limited scalability because the server may become a bottleneck as the number of clients increases.</w:t>
+      </w:r>
+    </w:p>
+    <w:p>
+      <w:pPr>
+        <w:numPr>
+          <w:ilvl w:val="0"/>
+          <w:numId w:val="21"/>
+        </w:numPr>
+        <w:rPr>
+          <w:b/>
+          <w:bCs/>
+          <w:color w:val="000000" w:themeColor="text1"/>
+        </w:rPr>
+      </w:pPr>
+      <w:r>
+        <w:rPr>
+          <w:b/>
+          <w:bCs/>
+          <w:color w:val="000000" w:themeColor="text1"/>
+        </w:rPr>
+        <w:t>Performance depends on server capacity.</w:t>
+      </w:r>
+    </w:p>
+    <w:p>
+      <w:pPr>
+        <w:numPr>
+          <w:ilvl w:val="0"/>
+          <w:numId w:val="21"/>
+        </w:numPr>
+        <w:rPr>
+          <w:b/>
+          <w:bCs/>
+          <w:color w:val="000000" w:themeColor="text1"/>
+        </w:rPr>
+      </w:pPr>
+      <w:r>
+        <w:rPr>
+          <w:b/>
+          <w:bCs/>
+          <w:color w:val="000000" w:themeColor="text1"/>
+        </w:rPr>
+        <w:t>Network dependency means clients cannot function properly if the server is unavailable.</w:t>
+      </w:r>
+    </w:p>
+    <w:p>
+      <w:pPr>
+        <w:numPr>
+          <w:ilvl w:val="0"/>
+          <w:numId w:val="21"/>
+        </w:numPr>
+        <w:rPr>
+          <w:b/>
+          <w:bCs/>
+          <w:color w:val="000000" w:themeColor="text1"/>
+        </w:rPr>
+      </w:pPr>
+      <w:r>
+        <w:rPr>
+          <w:b/>
+          <w:bCs/>
+          <w:color w:val="000000" w:themeColor="text1"/>
+        </w:rPr>
+        <w:t>Less flexible than decentralized architectures because control is concentrated in one place.</w:t>
+      </w:r>
+    </w:p>
+    <w:p>
+      <w:pPr>
+        <w:rPr>
+          <w:b/>
+          <w:bCs/>
+          <w:color w:val="000000" w:themeColor="text1"/>
+        </w:rPr>
+      </w:pPr>
+      <w:r>
+        <w:rPr>
+          <w:b/>
+          <w:bCs/>
+          <w:color w:val="000000" w:themeColor="text1"/>
+        </w:rPr>
+        <w:t>Risks</w:t>
+      </w:r>
+    </w:p>
+    <w:p>
+      <w:pPr>
+        <w:numPr>
+          <w:ilvl w:val="0"/>
+          <w:numId w:val="22"/>
+        </w:numPr>
+        <w:rPr>
+          <w:b/>
+          <w:bCs/>
+          <w:color w:val="000000" w:themeColor="text1"/>
+        </w:rPr>
+      </w:pPr>
+      <w:r>
+        <w:rPr>
+          <w:b/>
+          <w:bCs/>
+          <w:color w:val="000000" w:themeColor="text1"/>
+        </w:rPr>
+        <w:t>Hardware or software failure of the server can disrupt all connected clients.</w:t>
+      </w:r>
+    </w:p>
+    <w:p>
+      <w:pPr>
+        <w:numPr>
+          <w:ilvl w:val="0"/>
+          <w:numId w:val="22"/>
+        </w:numPr>
+        <w:rPr>
+          <w:b/>
+          <w:bCs/>
+          <w:color w:val="000000" w:themeColor="text1"/>
+        </w:rPr>
+      </w:pPr>
+      <w:r>
+        <w:rPr>
+          <w:b/>
+          <w:bCs/>
+          <w:color w:val="000000" w:themeColor="text1"/>
+        </w:rPr>
+        <w:t>Cyberattacks targeting the central server can affect the entire system.</w:t>
+      </w:r>
+    </w:p>
+    <w:p>
+      <w:pPr>
+        <w:numPr>
+          <w:ilvl w:val="0"/>
+          <w:numId w:val="22"/>
+        </w:numPr>
+        <w:rPr>
+          <w:b/>
+          <w:bCs/>
+          <w:color w:val="000000" w:themeColor="text1"/>
+        </w:rPr>
+      </w:pPr>
+      <w:r>
+        <w:rPr>
+          <w:b/>
+          <w:bCs/>
+          <w:color w:val="000000" w:themeColor="text1"/>
+        </w:rPr>
+        <w:t>Rapid growth in users may exceed server capacity if scaling is not planned.</w:t>
+      </w:r>
+    </w:p>
+    <w:p>
+      <w:pPr>
+        <w:numPr>
+          <w:ilvl w:val="0"/>
+          <w:numId w:val="22"/>
+        </w:numPr>
+        <w:rPr>
+          <w:b/>
+          <w:bCs/>
+          <w:color w:val="000000" w:themeColor="text1"/>
+        </w:rPr>
+      </w:pPr>
+      <w:r>
+        <w:rPr>
+          <w:b/>
+          <w:bCs/>
+          <w:color w:val="000000" w:themeColor="text1"/>
+        </w:rPr>
+        <w:t>Data loss can occur if backup and disaster recovery strategies are inadequate.</w:t>
+      </w:r>
+    </w:p>
+    <w:p>
+      <w:pPr>
+        <w:rPr>
+          <w:b/>
+          <w:bCs/>
+          <w:color w:val="000000" w:themeColor="text1"/>
+        </w:rPr>
+      </w:pPr>
+      <w:r>
+        <w:rPr>
+          <w:b/>
+          <w:bCs/>
+          <w:color w:val="000000" w:themeColor="text1"/>
+        </w:rPr>
+        <w:pict w14:anchorId="771BFDD3">
+          <v:rect id="_x0000_i1028" style="width:0;height:1.5pt" o:hralign="center" o:hrstd="t" o:hr="t" fillcolor="#a0a0a0" stroked="f"/>
         </w:pict>
       </w:r>
     </w:p>
@@ -849,43 +1434,107 @@
     </w:p>
     <w:p>
       <w:pPr>
-        <w:rPr>
-          <w:color w:val="000000" w:themeColor="text1"/>
-        </w:rPr>
-      </w:pPr>
-      <w:r>
-        <w:rPr>
-          <w:color w:val="000000" w:themeColor="text1"/>
-        </w:rPr>
-        <w:t>• High scalability because adding more peers can increase available resources.</w:t>
-      </w:r>
-      <w:r>
-        <w:rPr>
-          <w:color w:val="000000" w:themeColor="text1"/>
-        </w:rPr>
-        <w:br/>
-        <w:t>• No single point of failure because services are distributed among peers.</w:t>
-      </w:r>
-      <w:r>
-        <w:rPr>
-          <w:color w:val="000000" w:themeColor="text1"/>
-        </w:rPr>
-        <w:br/>
-        <w:t>• Efficient resource sharing as each peer can provide and consume resources.</w:t>
-      </w:r>
-      <w:r>
-        <w:rPr>
-          <w:color w:val="000000" w:themeColor="text1"/>
-        </w:rPr>
-        <w:br/>
-        <w:t>• Reduced infrastructure costs because no central server is required.</w:t>
-      </w:r>
-      <w:r>
-        <w:rPr>
-          <w:color w:val="000000" w:themeColor="text1"/>
-        </w:rPr>
-        <w:br/>
-        <w:t>• Good fault tolerance because the failure of one peer does not necessarily stop the entire system.</w:t>
+        <w:numPr>
+          <w:ilvl w:val="0"/>
+          <w:numId w:val="23"/>
+        </w:numPr>
+        <w:rPr>
+          <w:b/>
+          <w:bCs/>
+          <w:color w:val="000000" w:themeColor="text1"/>
+        </w:rPr>
+      </w:pPr>
+      <w:r>
+        <w:rPr>
+          <w:b/>
+          <w:bCs/>
+          <w:color w:val="000000" w:themeColor="text1"/>
+        </w:rPr>
+        <w:t>High scalability because adding more peers can increase available resources.</w:t>
+      </w:r>
+    </w:p>
+    <w:p>
+      <w:pPr>
+        <w:numPr>
+          <w:ilvl w:val="0"/>
+          <w:numId w:val="23"/>
+        </w:numPr>
+        <w:rPr>
+          <w:b/>
+          <w:bCs/>
+          <w:color w:val="000000" w:themeColor="text1"/>
+        </w:rPr>
+      </w:pPr>
+      <w:r>
+        <w:rPr>
+          <w:b/>
+          <w:bCs/>
+          <w:color w:val="000000" w:themeColor="text1"/>
+        </w:rPr>
+        <w:t>No single point of failure because services are distributed among peers.</w:t>
+      </w:r>
+    </w:p>
+    <w:p>
+      <w:pPr>
+        <w:numPr>
+          <w:ilvl w:val="0"/>
+          <w:numId w:val="23"/>
+        </w:numPr>
+        <w:rPr>
+          <w:b/>
+          <w:bCs/>
+          <w:color w:val="000000" w:themeColor="text1"/>
+        </w:rPr>
+      </w:pPr>
+      <w:r>
+        <w:rPr>
+          <w:b/>
+          <w:bCs/>
+          <w:color w:val="000000" w:themeColor="text1"/>
+        </w:rPr>
+        <w:t>Efficient resource sharing as each peer can provide and consume resources.</w:t>
+      </w:r>
+    </w:p>
+    <w:p>
+      <w:pPr>
+        <w:numPr>
+          <w:ilvl w:val="0"/>
+          <w:numId w:val="23"/>
+        </w:numPr>
+        <w:rPr>
+          <w:b/>
+          <w:bCs/>
+          <w:color w:val="000000" w:themeColor="text1"/>
+        </w:rPr>
+      </w:pPr>
+      <w:r>
+        <w:rPr>
+          <w:b/>
+          <w:bCs/>
+          <w:color w:val="000000" w:themeColor="text1"/>
+        </w:rPr>
+        <w:t>Reduced infrastructure costs because no central server is required.</w:t>
+      </w:r>
+    </w:p>
+    <w:p>
+      <w:pPr>
+        <w:numPr>
+          <w:ilvl w:val="0"/>
+          <w:numId w:val="23"/>
+        </w:numPr>
+        <w:rPr>
+          <w:b/>
+          <w:bCs/>
+          <w:color w:val="000000" w:themeColor="text1"/>
+        </w:rPr>
+      </w:pPr>
+      <w:r>
+        <w:rPr>
+          <w:b/>
+          <w:bCs/>
+          <w:color w:val="000000" w:themeColor="text1"/>
+        </w:rPr>
+        <w:t>Good fault tolerance because the failure of one peer does not necessarily stop the entire system.</w:t>
       </w:r>
     </w:p>
     <w:p>
@@ -907,60 +1556,214 @@
     </w:p>
     <w:p>
       <w:pPr>
-        <w:rPr>
-          <w:color w:val="000000" w:themeColor="text1"/>
-        </w:rPr>
-      </w:pPr>
-      <w:r>
-        <w:rPr>
-          <w:color w:val="000000" w:themeColor="text1"/>
-        </w:rPr>
-        <w:t>• Harder security management because there is no central authority controlling access.</w:t>
-      </w:r>
-      <w:r>
-        <w:rPr>
-          <w:color w:val="000000" w:themeColor="text1"/>
-        </w:rPr>
-        <w:br/>
-        <w:t>• More difficult maintenance and updates because software must be managed across many independent nodes.</w:t>
-      </w:r>
-      <w:r>
-        <w:rPr>
-          <w:color w:val="000000" w:themeColor="text1"/>
-        </w:rPr>
-        <w:br/>
-        <w:t>• Complex coordination between peers.</w:t>
-      </w:r>
-      <w:r>
-        <w:rPr>
-          <w:color w:val="000000" w:themeColor="text1"/>
-        </w:rPr>
-        <w:br/>
-        <w:t>• Data consistency can be challenging because information may be distributed across multiple nodes.</w:t>
-      </w:r>
-      <w:r>
-        <w:rPr>
-          <w:color w:val="000000" w:themeColor="text1"/>
-        </w:rPr>
-        <w:br/>
-        <w:t xml:space="preserve">• </w:t>
-      </w:r>
-      <w:r>
-        <w:rPr>
-          <w:color w:val="000000" w:themeColor="text1"/>
-        </w:rPr>
-        <w:t>Performance can be unpredictable</w:t>
-      </w:r>
-      <w:r>
-        <w:rPr>
-          <w:color w:val="000000" w:themeColor="text1"/>
-        </w:rPr>
-        <w:t xml:space="preserve"> because it depends on the availability and capability of individual peers.</w:t>
+        <w:numPr>
+          <w:ilvl w:val="0"/>
+          <w:numId w:val="24"/>
+        </w:numPr>
+        <w:rPr>
+          <w:b/>
+          <w:bCs/>
+          <w:color w:val="000000" w:themeColor="text1"/>
+        </w:rPr>
+      </w:pPr>
+      <w:r>
+        <w:rPr>
+          <w:b/>
+          <w:bCs/>
+          <w:color w:val="000000" w:themeColor="text1"/>
+        </w:rPr>
+        <w:t>Harder security management because there is no central authority controlling access.</w:t>
+      </w:r>
+    </w:p>
+    <w:p>
+      <w:pPr>
+        <w:numPr>
+          <w:ilvl w:val="0"/>
+          <w:numId w:val="24"/>
+        </w:numPr>
+        <w:rPr>
+          <w:b/>
+          <w:bCs/>
+          <w:color w:val="000000" w:themeColor="text1"/>
+        </w:rPr>
+      </w:pPr>
+      <w:r>
+        <w:rPr>
+          <w:b/>
+          <w:bCs/>
+          <w:color w:val="000000" w:themeColor="text1"/>
+        </w:rPr>
+        <w:t>More difficult maintenance and updates because software must be managed across many independent nodes.</w:t>
+      </w:r>
+    </w:p>
+    <w:p>
+      <w:pPr>
+        <w:numPr>
+          <w:ilvl w:val="0"/>
+          <w:numId w:val="24"/>
+        </w:numPr>
+        <w:rPr>
+          <w:b/>
+          <w:bCs/>
+          <w:color w:val="000000" w:themeColor="text1"/>
+        </w:rPr>
+      </w:pPr>
+      <w:r>
+        <w:rPr>
+          <w:b/>
+          <w:bCs/>
+          <w:color w:val="000000" w:themeColor="text1"/>
+        </w:rPr>
+        <w:t>Complex coordination between peers.</w:t>
+      </w:r>
+    </w:p>
+    <w:p>
+      <w:pPr>
+        <w:numPr>
+          <w:ilvl w:val="0"/>
+          <w:numId w:val="24"/>
+        </w:numPr>
+        <w:rPr>
+          <w:b/>
+          <w:bCs/>
+          <w:color w:val="000000" w:themeColor="text1"/>
+        </w:rPr>
+      </w:pPr>
+      <w:r>
+        <w:rPr>
+          <w:b/>
+          <w:bCs/>
+          <w:color w:val="000000" w:themeColor="text1"/>
+        </w:rPr>
+        <w:t>Data consistency can be challenging because information may be distributed across multiple nodes.</w:t>
+      </w:r>
+    </w:p>
+    <w:p>
+      <w:pPr>
+        <w:numPr>
+          <w:ilvl w:val="0"/>
+          <w:numId w:val="24"/>
+        </w:numPr>
+        <w:rPr>
+          <w:b/>
+          <w:bCs/>
+          <w:color w:val="000000" w:themeColor="text1"/>
+        </w:rPr>
+      </w:pPr>
+      <w:r>
+        <w:rPr>
+          <w:b/>
+          <w:bCs/>
+          <w:color w:val="000000" w:themeColor="text1"/>
+        </w:rPr>
+        <w:t>Performance can be unpredictable because it depends on the availability and capability of individual peers.</w:t>
+      </w:r>
+    </w:p>
+    <w:p>
+      <w:pPr>
+        <w:rPr>
+          <w:b/>
+          <w:bCs/>
+          <w:color w:val="000000" w:themeColor="text1"/>
+        </w:rPr>
+      </w:pPr>
+      <w:r>
+        <w:rPr>
+          <w:b/>
+          <w:bCs/>
+          <w:color w:val="000000" w:themeColor="text1"/>
+        </w:rPr>
+        <w:t>Risks</w:t>
+      </w:r>
+    </w:p>
+    <w:p>
+      <w:pPr>
+        <w:numPr>
+          <w:ilvl w:val="0"/>
+          <w:numId w:val="25"/>
+        </w:numPr>
+        <w:rPr>
+          <w:b/>
+          <w:bCs/>
+          <w:color w:val="000000" w:themeColor="text1"/>
+        </w:rPr>
+      </w:pPr>
+      <w:r>
+        <w:rPr>
+          <w:b/>
+          <w:bCs/>
+          <w:color w:val="000000" w:themeColor="text1"/>
+        </w:rPr>
+        <w:t>Malicious or compromised peers can spread malware or false data.</w:t>
+      </w:r>
+    </w:p>
+    <w:p>
+      <w:pPr>
+        <w:numPr>
+          <w:ilvl w:val="0"/>
+          <w:numId w:val="25"/>
+        </w:numPr>
+        <w:rPr>
+          <w:b/>
+          <w:bCs/>
+          <w:color w:val="000000" w:themeColor="text1"/>
+        </w:rPr>
+      </w:pPr>
+      <w:r>
+        <w:rPr>
+          <w:b/>
+          <w:bCs/>
+          <w:color w:val="000000" w:themeColor="text1"/>
+        </w:rPr>
+        <w:t>Unreliable peer availability may reduce system performance or availability.</w:t>
+      </w:r>
+    </w:p>
+    <w:p>
+      <w:pPr>
+        <w:numPr>
+          <w:ilvl w:val="0"/>
+          <w:numId w:val="25"/>
+        </w:numPr>
+        <w:rPr>
+          <w:b/>
+          <w:bCs/>
+          <w:color w:val="000000" w:themeColor="text1"/>
+        </w:rPr>
+      </w:pPr>
+      <w:r>
+        <w:rPr>
+          <w:b/>
+          <w:bCs/>
+          <w:color w:val="000000" w:themeColor="text1"/>
+        </w:rPr>
+        <w:t>Sensitive data may be exposed if peer security is weak.</w:t>
+      </w:r>
+    </w:p>
+    <w:p>
+      <w:pPr>
+        <w:numPr>
+          <w:ilvl w:val="0"/>
+          <w:numId w:val="25"/>
+        </w:numPr>
+        <w:rPr>
+          <w:b/>
+          <w:bCs/>
+          <w:color w:val="000000" w:themeColor="text1"/>
+        </w:rPr>
+      </w:pPr>
+      <w:r>
+        <w:rPr>
+          <w:b/>
+          <w:bCs/>
+          <w:color w:val="000000" w:themeColor="text1"/>
+        </w:rPr>
+        <w:lastRenderedPageBreak/>
+        <w:t>Monitoring, auditing, and regulatory compliance can be difficult in decentralized environments.</w:t>
       </w:r>
     </w:p>
     <w:tbl>
       <w:tblPr>
-        <w:tblW w:w="11459" w:type="dxa"/>
+        <w:tblW w:w="11263" w:type="dxa"/>
         <w:tblCellSpacing w:w="15" w:type="dxa"/>
         <w:tblInd w:w="-1188" w:type="dxa"/>
         <w:tblCellMar>
@@ -972,16 +1775,16 @@
         <w:tblLook w:val="04A0" w:firstRow="1" w:lastRow="0" w:firstColumn="1" w:lastColumn="0" w:noHBand="0" w:noVBand="1"/>
       </w:tblPr>
       <w:tblGrid>
-        <w:gridCol w:w="2706"/>
-        <w:gridCol w:w="1062"/>
-        <w:gridCol w:w="1555"/>
-        <w:gridCol w:w="1979"/>
-        <w:gridCol w:w="2651"/>
-        <w:gridCol w:w="1506"/>
+        <w:gridCol w:w="2659"/>
+        <w:gridCol w:w="1044"/>
+        <w:gridCol w:w="1529"/>
+        <w:gridCol w:w="1945"/>
+        <w:gridCol w:w="2605"/>
+        <w:gridCol w:w="1481"/>
       </w:tblGrid>
       <w:tr>
         <w:trPr>
-          <w:trHeight w:val="1150"/>
+          <w:trHeight w:val="1157"/>
           <w:tblHeader/>
           <w:tblCellSpacing w:w="15" w:type="dxa"/>
         </w:trPr>
@@ -1005,7 +1808,6 @@
                 <w:bCs/>
                 <w:color w:val="000000" w:themeColor="text1"/>
               </w:rPr>
-              <w:lastRenderedPageBreak/>
               <w:t>Quality Attribute</w:t>
             </w:r>
           </w:p>
@@ -1133,7 +1935,7 @@
       </w:tr>
       <w:tr>
         <w:trPr>
-          <w:trHeight w:val="675"/>
+          <w:trHeight w:val="679"/>
           <w:tblCellSpacing w:w="15" w:type="dxa"/>
         </w:trPr>
         <w:tc>
@@ -1261,7 +2063,7 @@
       </w:tr>
       <w:tr>
         <w:trPr>
-          <w:trHeight w:val="1150"/>
+          <w:trHeight w:val="1157"/>
           <w:tblCellSpacing w:w="15" w:type="dxa"/>
         </w:trPr>
         <w:tc>
@@ -1389,7 +2191,7 @@
       </w:tr>
       <w:tr>
         <w:trPr>
-          <w:trHeight w:val="675"/>
+          <w:trHeight w:val="679"/>
           <w:tblCellSpacing w:w="15" w:type="dxa"/>
         </w:trPr>
         <w:tc>
@@ -1411,26 +2213,6 @@
                 <w:color w:val="000000" w:themeColor="text1"/>
               </w:rPr>
               <w:t>Reliability</w:t>
-            </w:r>
-          </w:p>
-        </w:tc>
-        <w:tc>
-          <w:tcPr>
-            <w:tcW w:w="0" w:type="auto"/>
-            <w:vAlign w:val="center"/>
-            <w:hideMark/>
-          </w:tcPr>
-          <w:p>
-            <w:pPr>
-              <w:rPr>
-                <w:color w:val="000000" w:themeColor="text1"/>
-              </w:rPr>
-            </w:pPr>
-            <w:r>
-              <w:rPr>
-                <w:color w:val="000000" w:themeColor="text1"/>
-              </w:rPr>
-              <w:t>-</w:t>
             </w:r>
           </w:p>
         </w:tc>
@@ -1514,10 +2296,30 @@
             </w:r>
           </w:p>
         </w:tc>
+        <w:tc>
+          <w:tcPr>
+            <w:tcW w:w="0" w:type="auto"/>
+            <w:vAlign w:val="center"/>
+            <w:hideMark/>
+          </w:tcPr>
+          <w:p>
+            <w:pPr>
+              <w:rPr>
+                <w:color w:val="000000" w:themeColor="text1"/>
+              </w:rPr>
+            </w:pPr>
+            <w:r>
+              <w:rPr>
+                <w:color w:val="000000" w:themeColor="text1"/>
+              </w:rPr>
+              <w:t>+</w:t>
+            </w:r>
+          </w:p>
+        </w:tc>
       </w:tr>
       <w:tr>
         <w:trPr>
-          <w:trHeight w:val="695"/>
+          <w:trHeight w:val="699"/>
           <w:tblCellSpacing w:w="15" w:type="dxa"/>
         </w:trPr>
         <w:tc>
@@ -1645,7 +2447,7 @@
       </w:tr>
       <w:tr>
         <w:trPr>
-          <w:trHeight w:val="695"/>
+          <w:trHeight w:val="699"/>
           <w:tblCellSpacing w:w="15" w:type="dxa"/>
         </w:trPr>
         <w:tc>
@@ -2134,6 +2936,155 @@
 <file path=word/numbering.xml><?xml version="1.0" encoding="utf-8"?>
 <w:numbering xmlns:wpc="http://schemas.microsoft.com/office/word/2010/wordprocessingCanvas" xmlns:cx="http://schemas.microsoft.com/office/drawing/2014/chartex" xmlns:cx1="http://schemas.microsoft.com/office/drawing/2015/9/8/chartex" xmlns:cx2="http://schemas.microsoft.com/office/drawing/2015/10/21/chartex" xmlns:cx3="http://schemas.microsoft.com/office/drawing/2016/5/9/chartex" xmlns:cx4="http://schemas.microsoft.com/office/drawing/2016/5/10/chartex" xmlns:cx5="http://schemas.microsoft.com/office/drawing/2016/5/11/chartex" xmlns:cx6="http://schemas.microsoft.com/office/drawing/2016/5/12/chartex" xmlns:cx7="http://schemas.microsoft.com/office/drawing/2016/5/13/chartex" xmlns:cx8="http://schemas.microsoft.com/office/drawing/2016/5/14/chartex" xmlns:mc="http://schemas.openxmlformats.org/markup-compatibility/2006" xmlns:aink="http://schemas.microsoft.com/office/drawing/2016/ink" xmlns:am3d="http://schemas.microsoft.com/office/drawing/2017/model3d" xmlns:o="urn:schemas-microsoft-com:office:office" xmlns:oel="http://schemas.microsoft.com/office/2019/extlst" xmlns:r="http://schemas.openxmlformats.org/officeDocument/2006/relationships" xmlns:m="http://schemas.openxmlformats.org/officeDocument/2006/math" xmlns:v="urn:schemas-microsoft-com:vml" xmlns:wp14="http://schemas.microsoft.com/office/word/2010/wordprocessingDrawing" xmlns:wp="http://schemas.openxmlformats.org/drawingml/2006/wordprocessingDrawing" xmlns:w10="urn:schemas-microsoft-com:office:word" xmlns:w="http://schemas.openxmlformats.org/wordprocessingml/2006/main" xmlns:w14="http://schemas.microsoft.com/office/word/2010/wordml" xmlns:w15="http://schemas.microsoft.com/office/word/2012/wordml" xmlns:w16cex="http://schemas.microsoft.com/office/word/2018/wordml/cex" xmlns:w16cid="http://schemas.microsoft.com/office/word/2016/wordml/cid" xmlns:w16="http://schemas.microsoft.com/office/word/2018/wordml" xmlns:w16du="http://schemas.microsoft.com/office/word/2023/wordml/word16du" xmlns:w16sdtdh="http://schemas.microsoft.com/office/word/2020/wordml/sdtdatahash" xmlns:w16sdtfl="http://schemas.microsoft.com/office/word/2024/wordml/sdtformatlock" xmlns:w16se="http://schemas.microsoft.com/office/word/2015/wordml/symex" xmlns:wpg="http://schemas.microsoft.com/office/word/2010/wordprocessingGroup" xmlns:wpi="http://schemas.microsoft.com/office/word/2010/wordprocessingInk" xmlns:wne="http://schemas.microsoft.com/office/word/2006/wordml" xmlns:wps="http://schemas.microsoft.com/office/word/2010/wordprocessingShape" mc:Ignorable="w14 w15 w16se w16cid w16 w16cex w16sdtdh w16sdtfl w16du wp14">
   <w:abstractNum w:abstractNumId="0" w15:restartNumberingAfterBreak="0">
+    <w:nsid w:val="052C2267"/>
+    <w:multiLevelType w:val="multilevel"/>
+    <w:tmpl w:val="F50C5874"/>
+    <w:lvl w:ilvl="0">
+      <w:start w:val="1"/>
+      <w:numFmt w:val="bullet"/>
+      <w:lvlText w:val=""/>
+      <w:lvlJc w:val="left"/>
+      <w:pPr>
+        <w:tabs>
+          <w:tab w:val="num" w:pos="720"/>
+        </w:tabs>
+        <w:ind w:left="720" w:hanging="360"/>
+      </w:pPr>
+      <w:rPr>
+        <w:rFonts w:ascii="Symbol" w:hAnsi="Symbol" w:hint="default"/>
+        <w:sz w:val="20"/>
+      </w:rPr>
+    </w:lvl>
+    <w:lvl w:ilvl="1" w:tentative="1">
+      <w:start w:val="1"/>
+      <w:numFmt w:val="bullet"/>
+      <w:lvlText w:val="o"/>
+      <w:lvlJc w:val="left"/>
+      <w:pPr>
+        <w:tabs>
+          <w:tab w:val="num" w:pos="1440"/>
+        </w:tabs>
+        <w:ind w:left="1440" w:hanging="360"/>
+      </w:pPr>
+      <w:rPr>
+        <w:rFonts w:ascii="Courier New" w:hAnsi="Courier New" w:hint="default"/>
+        <w:sz w:val="20"/>
+      </w:rPr>
+    </w:lvl>
+    <w:lvl w:ilvl="2" w:tentative="1">
+      <w:start w:val="1"/>
+      <w:numFmt w:val="bullet"/>
+      <w:lvlText w:val=""/>
+      <w:lvlJc w:val="left"/>
+      <w:pPr>
+        <w:tabs>
+          <w:tab w:val="num" w:pos="2160"/>
+        </w:tabs>
+        <w:ind w:left="2160" w:hanging="360"/>
+      </w:pPr>
+      <w:rPr>
+        <w:rFonts w:ascii="Wingdings" w:hAnsi="Wingdings" w:hint="default"/>
+        <w:sz w:val="20"/>
+      </w:rPr>
+    </w:lvl>
+    <w:lvl w:ilvl="3" w:tentative="1">
+      <w:start w:val="1"/>
+      <w:numFmt w:val="bullet"/>
+      <w:lvlText w:val=""/>
+      <w:lvlJc w:val="left"/>
+      <w:pPr>
+        <w:tabs>
+          <w:tab w:val="num" w:pos="2880"/>
+        </w:tabs>
+        <w:ind w:left="2880" w:hanging="360"/>
+      </w:pPr>
+      <w:rPr>
+        <w:rFonts w:ascii="Wingdings" w:hAnsi="Wingdings" w:hint="default"/>
+        <w:sz w:val="20"/>
+      </w:rPr>
+    </w:lvl>
+    <w:lvl w:ilvl="4" w:tentative="1">
+      <w:start w:val="1"/>
+      <w:numFmt w:val="bullet"/>
+      <w:lvlText w:val=""/>
+      <w:lvlJc w:val="left"/>
+      <w:pPr>
+        <w:tabs>
+          <w:tab w:val="num" w:pos="3600"/>
+        </w:tabs>
+        <w:ind w:left="3600" w:hanging="360"/>
+      </w:pPr>
+      <w:rPr>
+        <w:rFonts w:ascii="Wingdings" w:hAnsi="Wingdings" w:hint="default"/>
+        <w:sz w:val="20"/>
+      </w:rPr>
+    </w:lvl>
+    <w:lvl w:ilvl="5" w:tentative="1">
+      <w:start w:val="1"/>
+      <w:numFmt w:val="bullet"/>
+      <w:lvlText w:val=""/>
+      <w:lvlJc w:val="left"/>
+      <w:pPr>
+        <w:tabs>
+          <w:tab w:val="num" w:pos="4320"/>
+        </w:tabs>
+        <w:ind w:left="4320" w:hanging="360"/>
+      </w:pPr>
+      <w:rPr>
+        <w:rFonts w:ascii="Wingdings" w:hAnsi="Wingdings" w:hint="default"/>
+        <w:sz w:val="20"/>
+      </w:rPr>
+    </w:lvl>
+    <w:lvl w:ilvl="6" w:tentative="1">
+      <w:start w:val="1"/>
+      <w:numFmt w:val="bullet"/>
+      <w:lvlText w:val=""/>
+      <w:lvlJc w:val="left"/>
+      <w:pPr>
+        <w:tabs>
+          <w:tab w:val="num" w:pos="5040"/>
+        </w:tabs>
+        <w:ind w:left="5040" w:hanging="360"/>
+      </w:pPr>
+      <w:rPr>
+        <w:rFonts w:ascii="Wingdings" w:hAnsi="Wingdings" w:hint="default"/>
+        <w:sz w:val="20"/>
+      </w:rPr>
+    </w:lvl>
+    <w:lvl w:ilvl="7" w:tentative="1">
+      <w:start w:val="1"/>
+      <w:numFmt w:val="bullet"/>
+      <w:lvlText w:val=""/>
+      <w:lvlJc w:val="left"/>
+      <w:pPr>
+        <w:tabs>
+          <w:tab w:val="num" w:pos="5760"/>
+        </w:tabs>
+        <w:ind w:left="5760" w:hanging="360"/>
+      </w:pPr>
+      <w:rPr>
+        <w:rFonts w:ascii="Wingdings" w:hAnsi="Wingdings" w:hint="default"/>
+        <w:sz w:val="20"/>
+      </w:rPr>
+    </w:lvl>
+    <w:lvl w:ilvl="8" w:tentative="1">
+      <w:start w:val="1"/>
+      <w:numFmt w:val="bullet"/>
+      <w:lvlText w:val=""/>
+      <w:lvlJc w:val="left"/>
+      <w:pPr>
+        <w:tabs>
+          <w:tab w:val="num" w:pos="6480"/>
+        </w:tabs>
+        <w:ind w:left="6480" w:hanging="360"/>
+      </w:pPr>
+      <w:rPr>
+        <w:rFonts w:ascii="Wingdings" w:hAnsi="Wingdings" w:hint="default"/>
+        <w:sz w:val="20"/>
+      </w:rPr>
+    </w:lvl>
+  </w:abstractNum>
+  <w:abstractNum w:abstractNumId="1" w15:restartNumberingAfterBreak="0">
     <w:nsid w:val="0A4A6895"/>
     <w:multiLevelType w:val="multilevel"/>
     <w:tmpl w:val="D9C4D0BE"/>
@@ -2282,7 +3233,156 @@
       </w:rPr>
     </w:lvl>
   </w:abstractNum>
-  <w:abstractNum w:abstractNumId="1" w15:restartNumberingAfterBreak="0">
+  <w:abstractNum w:abstractNumId="2" w15:restartNumberingAfterBreak="0">
+    <w:nsid w:val="0F9A397B"/>
+    <w:multiLevelType w:val="multilevel"/>
+    <w:tmpl w:val="CA56EA90"/>
+    <w:lvl w:ilvl="0">
+      <w:start w:val="1"/>
+      <w:numFmt w:val="bullet"/>
+      <w:lvlText w:val=""/>
+      <w:lvlJc w:val="left"/>
+      <w:pPr>
+        <w:tabs>
+          <w:tab w:val="num" w:pos="720"/>
+        </w:tabs>
+        <w:ind w:left="720" w:hanging="360"/>
+      </w:pPr>
+      <w:rPr>
+        <w:rFonts w:ascii="Symbol" w:hAnsi="Symbol" w:hint="default"/>
+        <w:sz w:val="20"/>
+      </w:rPr>
+    </w:lvl>
+    <w:lvl w:ilvl="1" w:tentative="1">
+      <w:start w:val="1"/>
+      <w:numFmt w:val="bullet"/>
+      <w:lvlText w:val="o"/>
+      <w:lvlJc w:val="left"/>
+      <w:pPr>
+        <w:tabs>
+          <w:tab w:val="num" w:pos="1440"/>
+        </w:tabs>
+        <w:ind w:left="1440" w:hanging="360"/>
+      </w:pPr>
+      <w:rPr>
+        <w:rFonts w:ascii="Courier New" w:hAnsi="Courier New" w:hint="default"/>
+        <w:sz w:val="20"/>
+      </w:rPr>
+    </w:lvl>
+    <w:lvl w:ilvl="2" w:tentative="1">
+      <w:start w:val="1"/>
+      <w:numFmt w:val="bullet"/>
+      <w:lvlText w:val=""/>
+      <w:lvlJc w:val="left"/>
+      <w:pPr>
+        <w:tabs>
+          <w:tab w:val="num" w:pos="2160"/>
+        </w:tabs>
+        <w:ind w:left="2160" w:hanging="360"/>
+      </w:pPr>
+      <w:rPr>
+        <w:rFonts w:ascii="Wingdings" w:hAnsi="Wingdings" w:hint="default"/>
+        <w:sz w:val="20"/>
+      </w:rPr>
+    </w:lvl>
+    <w:lvl w:ilvl="3" w:tentative="1">
+      <w:start w:val="1"/>
+      <w:numFmt w:val="bullet"/>
+      <w:lvlText w:val=""/>
+      <w:lvlJc w:val="left"/>
+      <w:pPr>
+        <w:tabs>
+          <w:tab w:val="num" w:pos="2880"/>
+        </w:tabs>
+        <w:ind w:left="2880" w:hanging="360"/>
+      </w:pPr>
+      <w:rPr>
+        <w:rFonts w:ascii="Wingdings" w:hAnsi="Wingdings" w:hint="default"/>
+        <w:sz w:val="20"/>
+      </w:rPr>
+    </w:lvl>
+    <w:lvl w:ilvl="4" w:tentative="1">
+      <w:start w:val="1"/>
+      <w:numFmt w:val="bullet"/>
+      <w:lvlText w:val=""/>
+      <w:lvlJc w:val="left"/>
+      <w:pPr>
+        <w:tabs>
+          <w:tab w:val="num" w:pos="3600"/>
+        </w:tabs>
+        <w:ind w:left="3600" w:hanging="360"/>
+      </w:pPr>
+      <w:rPr>
+        <w:rFonts w:ascii="Wingdings" w:hAnsi="Wingdings" w:hint="default"/>
+        <w:sz w:val="20"/>
+      </w:rPr>
+    </w:lvl>
+    <w:lvl w:ilvl="5" w:tentative="1">
+      <w:start w:val="1"/>
+      <w:numFmt w:val="bullet"/>
+      <w:lvlText w:val=""/>
+      <w:lvlJc w:val="left"/>
+      <w:pPr>
+        <w:tabs>
+          <w:tab w:val="num" w:pos="4320"/>
+        </w:tabs>
+        <w:ind w:left="4320" w:hanging="360"/>
+      </w:pPr>
+      <w:rPr>
+        <w:rFonts w:ascii="Wingdings" w:hAnsi="Wingdings" w:hint="default"/>
+        <w:sz w:val="20"/>
+      </w:rPr>
+    </w:lvl>
+    <w:lvl w:ilvl="6" w:tentative="1">
+      <w:start w:val="1"/>
+      <w:numFmt w:val="bullet"/>
+      <w:lvlText w:val=""/>
+      <w:lvlJc w:val="left"/>
+      <w:pPr>
+        <w:tabs>
+          <w:tab w:val="num" w:pos="5040"/>
+        </w:tabs>
+        <w:ind w:left="5040" w:hanging="360"/>
+      </w:pPr>
+      <w:rPr>
+        <w:rFonts w:ascii="Wingdings" w:hAnsi="Wingdings" w:hint="default"/>
+        <w:sz w:val="20"/>
+      </w:rPr>
+    </w:lvl>
+    <w:lvl w:ilvl="7" w:tentative="1">
+      <w:start w:val="1"/>
+      <w:numFmt w:val="bullet"/>
+      <w:lvlText w:val=""/>
+      <w:lvlJc w:val="left"/>
+      <w:pPr>
+        <w:tabs>
+          <w:tab w:val="num" w:pos="5760"/>
+        </w:tabs>
+        <w:ind w:left="5760" w:hanging="360"/>
+      </w:pPr>
+      <w:rPr>
+        <w:rFonts w:ascii="Wingdings" w:hAnsi="Wingdings" w:hint="default"/>
+        <w:sz w:val="20"/>
+      </w:rPr>
+    </w:lvl>
+    <w:lvl w:ilvl="8" w:tentative="1">
+      <w:start w:val="1"/>
+      <w:numFmt w:val="bullet"/>
+      <w:lvlText w:val=""/>
+      <w:lvlJc w:val="left"/>
+      <w:pPr>
+        <w:tabs>
+          <w:tab w:val="num" w:pos="6480"/>
+        </w:tabs>
+        <w:ind w:left="6480" w:hanging="360"/>
+      </w:pPr>
+      <w:rPr>
+        <w:rFonts w:ascii="Wingdings" w:hAnsi="Wingdings" w:hint="default"/>
+        <w:sz w:val="20"/>
+      </w:rPr>
+    </w:lvl>
+  </w:abstractNum>
+  <w:abstractNum w:abstractNumId="3" w15:restartNumberingAfterBreak="0">
     <w:nsid w:val="11A817B1"/>
     <w:multiLevelType w:val="multilevel"/>
     <w:tmpl w:val="3CBC55D2"/>
@@ -2431,7 +3531,7 @@
       </w:rPr>
     </w:lvl>
   </w:abstractNum>
-  <w:abstractNum w:abstractNumId="2" w15:restartNumberingAfterBreak="0">
+  <w:abstractNum w:abstractNumId="4" w15:restartNumberingAfterBreak="0">
     <w:nsid w:val="13943D9E"/>
     <w:multiLevelType w:val="multilevel"/>
     <w:tmpl w:val="0922A1BE"/>
@@ -2580,7 +3680,305 @@
       </w:rPr>
     </w:lvl>
   </w:abstractNum>
-  <w:abstractNum w:abstractNumId="3" w15:restartNumberingAfterBreak="0">
+  <w:abstractNum w:abstractNumId="5" w15:restartNumberingAfterBreak="0">
+    <w:nsid w:val="16A97C67"/>
+    <w:multiLevelType w:val="multilevel"/>
+    <w:tmpl w:val="800023AE"/>
+    <w:lvl w:ilvl="0">
+      <w:start w:val="1"/>
+      <w:numFmt w:val="bullet"/>
+      <w:lvlText w:val=""/>
+      <w:lvlJc w:val="left"/>
+      <w:pPr>
+        <w:tabs>
+          <w:tab w:val="num" w:pos="720"/>
+        </w:tabs>
+        <w:ind w:left="720" w:hanging="360"/>
+      </w:pPr>
+      <w:rPr>
+        <w:rFonts w:ascii="Symbol" w:hAnsi="Symbol" w:hint="default"/>
+        <w:sz w:val="20"/>
+      </w:rPr>
+    </w:lvl>
+    <w:lvl w:ilvl="1" w:tentative="1">
+      <w:start w:val="1"/>
+      <w:numFmt w:val="bullet"/>
+      <w:lvlText w:val="o"/>
+      <w:lvlJc w:val="left"/>
+      <w:pPr>
+        <w:tabs>
+          <w:tab w:val="num" w:pos="1440"/>
+        </w:tabs>
+        <w:ind w:left="1440" w:hanging="360"/>
+      </w:pPr>
+      <w:rPr>
+        <w:rFonts w:ascii="Courier New" w:hAnsi="Courier New" w:hint="default"/>
+        <w:sz w:val="20"/>
+      </w:rPr>
+    </w:lvl>
+    <w:lvl w:ilvl="2" w:tentative="1">
+      <w:start w:val="1"/>
+      <w:numFmt w:val="bullet"/>
+      <w:lvlText w:val=""/>
+      <w:lvlJc w:val="left"/>
+      <w:pPr>
+        <w:tabs>
+          <w:tab w:val="num" w:pos="2160"/>
+        </w:tabs>
+        <w:ind w:left="2160" w:hanging="360"/>
+      </w:pPr>
+      <w:rPr>
+        <w:rFonts w:ascii="Wingdings" w:hAnsi="Wingdings" w:hint="default"/>
+        <w:sz w:val="20"/>
+      </w:rPr>
+    </w:lvl>
+    <w:lvl w:ilvl="3" w:tentative="1">
+      <w:start w:val="1"/>
+      <w:numFmt w:val="bullet"/>
+      <w:lvlText w:val=""/>
+      <w:lvlJc w:val="left"/>
+      <w:pPr>
+        <w:tabs>
+          <w:tab w:val="num" w:pos="2880"/>
+        </w:tabs>
+        <w:ind w:left="2880" w:hanging="360"/>
+      </w:pPr>
+      <w:rPr>
+        <w:rFonts w:ascii="Wingdings" w:hAnsi="Wingdings" w:hint="default"/>
+        <w:sz w:val="20"/>
+      </w:rPr>
+    </w:lvl>
+    <w:lvl w:ilvl="4" w:tentative="1">
+      <w:start w:val="1"/>
+      <w:numFmt w:val="bullet"/>
+      <w:lvlText w:val=""/>
+      <w:lvlJc w:val="left"/>
+      <w:pPr>
+        <w:tabs>
+          <w:tab w:val="num" w:pos="3600"/>
+        </w:tabs>
+        <w:ind w:left="3600" w:hanging="360"/>
+      </w:pPr>
+      <w:rPr>
+        <w:rFonts w:ascii="Wingdings" w:hAnsi="Wingdings" w:hint="default"/>
+        <w:sz w:val="20"/>
+      </w:rPr>
+    </w:lvl>
+    <w:lvl w:ilvl="5" w:tentative="1">
+      <w:start w:val="1"/>
+      <w:numFmt w:val="bullet"/>
+      <w:lvlText w:val=""/>
+      <w:lvlJc w:val="left"/>
+      <w:pPr>
+        <w:tabs>
+          <w:tab w:val="num" w:pos="4320"/>
+        </w:tabs>
+        <w:ind w:left="4320" w:hanging="360"/>
+      </w:pPr>
+      <w:rPr>
+        <w:rFonts w:ascii="Wingdings" w:hAnsi="Wingdings" w:hint="default"/>
+        <w:sz w:val="20"/>
+      </w:rPr>
+    </w:lvl>
+    <w:lvl w:ilvl="6" w:tentative="1">
+      <w:start w:val="1"/>
+      <w:numFmt w:val="bullet"/>
+      <w:lvlText w:val=""/>
+      <w:lvlJc w:val="left"/>
+      <w:pPr>
+        <w:tabs>
+          <w:tab w:val="num" w:pos="5040"/>
+        </w:tabs>
+        <w:ind w:left="5040" w:hanging="360"/>
+      </w:pPr>
+      <w:rPr>
+        <w:rFonts w:ascii="Wingdings" w:hAnsi="Wingdings" w:hint="default"/>
+        <w:sz w:val="20"/>
+      </w:rPr>
+    </w:lvl>
+    <w:lvl w:ilvl="7" w:tentative="1">
+      <w:start w:val="1"/>
+      <w:numFmt w:val="bullet"/>
+      <w:lvlText w:val=""/>
+      <w:lvlJc w:val="left"/>
+      <w:pPr>
+        <w:tabs>
+          <w:tab w:val="num" w:pos="5760"/>
+        </w:tabs>
+        <w:ind w:left="5760" w:hanging="360"/>
+      </w:pPr>
+      <w:rPr>
+        <w:rFonts w:ascii="Wingdings" w:hAnsi="Wingdings" w:hint="default"/>
+        <w:sz w:val="20"/>
+      </w:rPr>
+    </w:lvl>
+    <w:lvl w:ilvl="8" w:tentative="1">
+      <w:start w:val="1"/>
+      <w:numFmt w:val="bullet"/>
+      <w:lvlText w:val=""/>
+      <w:lvlJc w:val="left"/>
+      <w:pPr>
+        <w:tabs>
+          <w:tab w:val="num" w:pos="6480"/>
+        </w:tabs>
+        <w:ind w:left="6480" w:hanging="360"/>
+      </w:pPr>
+      <w:rPr>
+        <w:rFonts w:ascii="Wingdings" w:hAnsi="Wingdings" w:hint="default"/>
+        <w:sz w:val="20"/>
+      </w:rPr>
+    </w:lvl>
+  </w:abstractNum>
+  <w:abstractNum w:abstractNumId="6" w15:restartNumberingAfterBreak="0">
+    <w:nsid w:val="1736377E"/>
+    <w:multiLevelType w:val="multilevel"/>
+    <w:tmpl w:val="287A34A6"/>
+    <w:lvl w:ilvl="0">
+      <w:start w:val="1"/>
+      <w:numFmt w:val="bullet"/>
+      <w:lvlText w:val=""/>
+      <w:lvlJc w:val="left"/>
+      <w:pPr>
+        <w:tabs>
+          <w:tab w:val="num" w:pos="720"/>
+        </w:tabs>
+        <w:ind w:left="720" w:hanging="360"/>
+      </w:pPr>
+      <w:rPr>
+        <w:rFonts w:ascii="Symbol" w:hAnsi="Symbol" w:hint="default"/>
+        <w:sz w:val="20"/>
+      </w:rPr>
+    </w:lvl>
+    <w:lvl w:ilvl="1" w:tentative="1">
+      <w:start w:val="1"/>
+      <w:numFmt w:val="bullet"/>
+      <w:lvlText w:val="o"/>
+      <w:lvlJc w:val="left"/>
+      <w:pPr>
+        <w:tabs>
+          <w:tab w:val="num" w:pos="1440"/>
+        </w:tabs>
+        <w:ind w:left="1440" w:hanging="360"/>
+      </w:pPr>
+      <w:rPr>
+        <w:rFonts w:ascii="Courier New" w:hAnsi="Courier New" w:hint="default"/>
+        <w:sz w:val="20"/>
+      </w:rPr>
+    </w:lvl>
+    <w:lvl w:ilvl="2" w:tentative="1">
+      <w:start w:val="1"/>
+      <w:numFmt w:val="bullet"/>
+      <w:lvlText w:val=""/>
+      <w:lvlJc w:val="left"/>
+      <w:pPr>
+        <w:tabs>
+          <w:tab w:val="num" w:pos="2160"/>
+        </w:tabs>
+        <w:ind w:left="2160" w:hanging="360"/>
+      </w:pPr>
+      <w:rPr>
+        <w:rFonts w:ascii="Wingdings" w:hAnsi="Wingdings" w:hint="default"/>
+        <w:sz w:val="20"/>
+      </w:rPr>
+    </w:lvl>
+    <w:lvl w:ilvl="3" w:tentative="1">
+      <w:start w:val="1"/>
+      <w:numFmt w:val="bullet"/>
+      <w:lvlText w:val=""/>
+      <w:lvlJc w:val="left"/>
+      <w:pPr>
+        <w:tabs>
+          <w:tab w:val="num" w:pos="2880"/>
+        </w:tabs>
+        <w:ind w:left="2880" w:hanging="360"/>
+      </w:pPr>
+      <w:rPr>
+        <w:rFonts w:ascii="Wingdings" w:hAnsi="Wingdings" w:hint="default"/>
+        <w:sz w:val="20"/>
+      </w:rPr>
+    </w:lvl>
+    <w:lvl w:ilvl="4" w:tentative="1">
+      <w:start w:val="1"/>
+      <w:numFmt w:val="bullet"/>
+      <w:lvlText w:val=""/>
+      <w:lvlJc w:val="left"/>
+      <w:pPr>
+        <w:tabs>
+          <w:tab w:val="num" w:pos="3600"/>
+        </w:tabs>
+        <w:ind w:left="3600" w:hanging="360"/>
+      </w:pPr>
+      <w:rPr>
+        <w:rFonts w:ascii="Wingdings" w:hAnsi="Wingdings" w:hint="default"/>
+        <w:sz w:val="20"/>
+      </w:rPr>
+    </w:lvl>
+    <w:lvl w:ilvl="5" w:tentative="1">
+      <w:start w:val="1"/>
+      <w:numFmt w:val="bullet"/>
+      <w:lvlText w:val=""/>
+      <w:lvlJc w:val="left"/>
+      <w:pPr>
+        <w:tabs>
+          <w:tab w:val="num" w:pos="4320"/>
+        </w:tabs>
+        <w:ind w:left="4320" w:hanging="360"/>
+      </w:pPr>
+      <w:rPr>
+        <w:rFonts w:ascii="Wingdings" w:hAnsi="Wingdings" w:hint="default"/>
+        <w:sz w:val="20"/>
+      </w:rPr>
+    </w:lvl>
+    <w:lvl w:ilvl="6" w:tentative="1">
+      <w:start w:val="1"/>
+      <w:numFmt w:val="bullet"/>
+      <w:lvlText w:val=""/>
+      <w:lvlJc w:val="left"/>
+      <w:pPr>
+        <w:tabs>
+          <w:tab w:val="num" w:pos="5040"/>
+        </w:tabs>
+        <w:ind w:left="5040" w:hanging="360"/>
+      </w:pPr>
+      <w:rPr>
+        <w:rFonts w:ascii="Wingdings" w:hAnsi="Wingdings" w:hint="default"/>
+        <w:sz w:val="20"/>
+      </w:rPr>
+    </w:lvl>
+    <w:lvl w:ilvl="7" w:tentative="1">
+      <w:start w:val="1"/>
+      <w:numFmt w:val="bullet"/>
+      <w:lvlText w:val=""/>
+      <w:lvlJc w:val="left"/>
+      <w:pPr>
+        <w:tabs>
+          <w:tab w:val="num" w:pos="5760"/>
+        </w:tabs>
+        <w:ind w:left="5760" w:hanging="360"/>
+      </w:pPr>
+      <w:rPr>
+        <w:rFonts w:ascii="Wingdings" w:hAnsi="Wingdings" w:hint="default"/>
+        <w:sz w:val="20"/>
+      </w:rPr>
+    </w:lvl>
+    <w:lvl w:ilvl="8" w:tentative="1">
+      <w:start w:val="1"/>
+      <w:numFmt w:val="bullet"/>
+      <w:lvlText w:val=""/>
+      <w:lvlJc w:val="left"/>
+      <w:pPr>
+        <w:tabs>
+          <w:tab w:val="num" w:pos="6480"/>
+        </w:tabs>
+        <w:ind w:left="6480" w:hanging="360"/>
+      </w:pPr>
+      <w:rPr>
+        <w:rFonts w:ascii="Wingdings" w:hAnsi="Wingdings" w:hint="default"/>
+        <w:sz w:val="20"/>
+      </w:rPr>
+    </w:lvl>
+  </w:abstractNum>
+  <w:abstractNum w:abstractNumId="7" w15:restartNumberingAfterBreak="0">
     <w:nsid w:val="22F30889"/>
     <w:multiLevelType w:val="multilevel"/>
     <w:tmpl w:val="2D5EB304"/>
@@ -2729,7 +4127,156 @@
       </w:rPr>
     </w:lvl>
   </w:abstractNum>
-  <w:abstractNum w:abstractNumId="4" w15:restartNumberingAfterBreak="0">
+  <w:abstractNum w:abstractNumId="8" w15:restartNumberingAfterBreak="0">
+    <w:nsid w:val="25DF13AE"/>
+    <w:multiLevelType w:val="multilevel"/>
+    <w:tmpl w:val="3EB8802E"/>
+    <w:lvl w:ilvl="0">
+      <w:start w:val="1"/>
+      <w:numFmt w:val="bullet"/>
+      <w:lvlText w:val=""/>
+      <w:lvlJc w:val="left"/>
+      <w:pPr>
+        <w:tabs>
+          <w:tab w:val="num" w:pos="720"/>
+        </w:tabs>
+        <w:ind w:left="720" w:hanging="360"/>
+      </w:pPr>
+      <w:rPr>
+        <w:rFonts w:ascii="Symbol" w:hAnsi="Symbol" w:hint="default"/>
+        <w:sz w:val="20"/>
+      </w:rPr>
+    </w:lvl>
+    <w:lvl w:ilvl="1" w:tentative="1">
+      <w:start w:val="1"/>
+      <w:numFmt w:val="bullet"/>
+      <w:lvlText w:val="o"/>
+      <w:lvlJc w:val="left"/>
+      <w:pPr>
+        <w:tabs>
+          <w:tab w:val="num" w:pos="1440"/>
+        </w:tabs>
+        <w:ind w:left="1440" w:hanging="360"/>
+      </w:pPr>
+      <w:rPr>
+        <w:rFonts w:ascii="Courier New" w:hAnsi="Courier New" w:hint="default"/>
+        <w:sz w:val="20"/>
+      </w:rPr>
+    </w:lvl>
+    <w:lvl w:ilvl="2" w:tentative="1">
+      <w:start w:val="1"/>
+      <w:numFmt w:val="bullet"/>
+      <w:lvlText w:val=""/>
+      <w:lvlJc w:val="left"/>
+      <w:pPr>
+        <w:tabs>
+          <w:tab w:val="num" w:pos="2160"/>
+        </w:tabs>
+        <w:ind w:left="2160" w:hanging="360"/>
+      </w:pPr>
+      <w:rPr>
+        <w:rFonts w:ascii="Wingdings" w:hAnsi="Wingdings" w:hint="default"/>
+        <w:sz w:val="20"/>
+      </w:rPr>
+    </w:lvl>
+    <w:lvl w:ilvl="3" w:tentative="1">
+      <w:start w:val="1"/>
+      <w:numFmt w:val="bullet"/>
+      <w:lvlText w:val=""/>
+      <w:lvlJc w:val="left"/>
+      <w:pPr>
+        <w:tabs>
+          <w:tab w:val="num" w:pos="2880"/>
+        </w:tabs>
+        <w:ind w:left="2880" w:hanging="360"/>
+      </w:pPr>
+      <w:rPr>
+        <w:rFonts w:ascii="Wingdings" w:hAnsi="Wingdings" w:hint="default"/>
+        <w:sz w:val="20"/>
+      </w:rPr>
+    </w:lvl>
+    <w:lvl w:ilvl="4" w:tentative="1">
+      <w:start w:val="1"/>
+      <w:numFmt w:val="bullet"/>
+      <w:lvlText w:val=""/>
+      <w:lvlJc w:val="left"/>
+      <w:pPr>
+        <w:tabs>
+          <w:tab w:val="num" w:pos="3600"/>
+        </w:tabs>
+        <w:ind w:left="3600" w:hanging="360"/>
+      </w:pPr>
+      <w:rPr>
+        <w:rFonts w:ascii="Wingdings" w:hAnsi="Wingdings" w:hint="default"/>
+        <w:sz w:val="20"/>
+      </w:rPr>
+    </w:lvl>
+    <w:lvl w:ilvl="5" w:tentative="1">
+      <w:start w:val="1"/>
+      <w:numFmt w:val="bullet"/>
+      <w:lvlText w:val=""/>
+      <w:lvlJc w:val="left"/>
+      <w:pPr>
+        <w:tabs>
+          <w:tab w:val="num" w:pos="4320"/>
+        </w:tabs>
+        <w:ind w:left="4320" w:hanging="360"/>
+      </w:pPr>
+      <w:rPr>
+        <w:rFonts w:ascii="Wingdings" w:hAnsi="Wingdings" w:hint="default"/>
+        <w:sz w:val="20"/>
+      </w:rPr>
+    </w:lvl>
+    <w:lvl w:ilvl="6" w:tentative="1">
+      <w:start w:val="1"/>
+      <w:numFmt w:val="bullet"/>
+      <w:lvlText w:val=""/>
+      <w:lvlJc w:val="left"/>
+      <w:pPr>
+        <w:tabs>
+          <w:tab w:val="num" w:pos="5040"/>
+        </w:tabs>
+        <w:ind w:left="5040" w:hanging="360"/>
+      </w:pPr>
+      <w:rPr>
+        <w:rFonts w:ascii="Wingdings" w:hAnsi="Wingdings" w:hint="default"/>
+        <w:sz w:val="20"/>
+      </w:rPr>
+    </w:lvl>
+    <w:lvl w:ilvl="7" w:tentative="1">
+      <w:start w:val="1"/>
+      <w:numFmt w:val="bullet"/>
+      <w:lvlText w:val=""/>
+      <w:lvlJc w:val="left"/>
+      <w:pPr>
+        <w:tabs>
+          <w:tab w:val="num" w:pos="5760"/>
+        </w:tabs>
+        <w:ind w:left="5760" w:hanging="360"/>
+      </w:pPr>
+      <w:rPr>
+        <w:rFonts w:ascii="Wingdings" w:hAnsi="Wingdings" w:hint="default"/>
+        <w:sz w:val="20"/>
+      </w:rPr>
+    </w:lvl>
+    <w:lvl w:ilvl="8" w:tentative="1">
+      <w:start w:val="1"/>
+      <w:numFmt w:val="bullet"/>
+      <w:lvlText w:val=""/>
+      <w:lvlJc w:val="left"/>
+      <w:pPr>
+        <w:tabs>
+          <w:tab w:val="num" w:pos="6480"/>
+        </w:tabs>
+        <w:ind w:left="6480" w:hanging="360"/>
+      </w:pPr>
+      <w:rPr>
+        <w:rFonts w:ascii="Wingdings" w:hAnsi="Wingdings" w:hint="default"/>
+        <w:sz w:val="20"/>
+      </w:rPr>
+    </w:lvl>
+  </w:abstractNum>
+  <w:abstractNum w:abstractNumId="9" w15:restartNumberingAfterBreak="0">
     <w:nsid w:val="27A05478"/>
     <w:multiLevelType w:val="multilevel"/>
     <w:tmpl w:val="AC98B37E"/>
@@ -2878,7 +4425,156 @@
       </w:rPr>
     </w:lvl>
   </w:abstractNum>
-  <w:abstractNum w:abstractNumId="5" w15:restartNumberingAfterBreak="0">
+  <w:abstractNum w:abstractNumId="10" w15:restartNumberingAfterBreak="0">
+    <w:nsid w:val="27EC4ECE"/>
+    <w:multiLevelType w:val="multilevel"/>
+    <w:tmpl w:val="F7088E86"/>
+    <w:lvl w:ilvl="0">
+      <w:start w:val="1"/>
+      <w:numFmt w:val="bullet"/>
+      <w:lvlText w:val=""/>
+      <w:lvlJc w:val="left"/>
+      <w:pPr>
+        <w:tabs>
+          <w:tab w:val="num" w:pos="720"/>
+        </w:tabs>
+        <w:ind w:left="720" w:hanging="360"/>
+      </w:pPr>
+      <w:rPr>
+        <w:rFonts w:ascii="Symbol" w:hAnsi="Symbol" w:hint="default"/>
+        <w:sz w:val="20"/>
+      </w:rPr>
+    </w:lvl>
+    <w:lvl w:ilvl="1" w:tentative="1">
+      <w:start w:val="1"/>
+      <w:numFmt w:val="bullet"/>
+      <w:lvlText w:val="o"/>
+      <w:lvlJc w:val="left"/>
+      <w:pPr>
+        <w:tabs>
+          <w:tab w:val="num" w:pos="1440"/>
+        </w:tabs>
+        <w:ind w:left="1440" w:hanging="360"/>
+      </w:pPr>
+      <w:rPr>
+        <w:rFonts w:ascii="Courier New" w:hAnsi="Courier New" w:hint="default"/>
+        <w:sz w:val="20"/>
+      </w:rPr>
+    </w:lvl>
+    <w:lvl w:ilvl="2" w:tentative="1">
+      <w:start w:val="1"/>
+      <w:numFmt w:val="bullet"/>
+      <w:lvlText w:val=""/>
+      <w:lvlJc w:val="left"/>
+      <w:pPr>
+        <w:tabs>
+          <w:tab w:val="num" w:pos="2160"/>
+        </w:tabs>
+        <w:ind w:left="2160" w:hanging="360"/>
+      </w:pPr>
+      <w:rPr>
+        <w:rFonts w:ascii="Wingdings" w:hAnsi="Wingdings" w:hint="default"/>
+        <w:sz w:val="20"/>
+      </w:rPr>
+    </w:lvl>
+    <w:lvl w:ilvl="3" w:tentative="1">
+      <w:start w:val="1"/>
+      <w:numFmt w:val="bullet"/>
+      <w:lvlText w:val=""/>
+      <w:lvlJc w:val="left"/>
+      <w:pPr>
+        <w:tabs>
+          <w:tab w:val="num" w:pos="2880"/>
+        </w:tabs>
+        <w:ind w:left="2880" w:hanging="360"/>
+      </w:pPr>
+      <w:rPr>
+        <w:rFonts w:ascii="Wingdings" w:hAnsi="Wingdings" w:hint="default"/>
+        <w:sz w:val="20"/>
+      </w:rPr>
+    </w:lvl>
+    <w:lvl w:ilvl="4" w:tentative="1">
+      <w:start w:val="1"/>
+      <w:numFmt w:val="bullet"/>
+      <w:lvlText w:val=""/>
+      <w:lvlJc w:val="left"/>
+      <w:pPr>
+        <w:tabs>
+          <w:tab w:val="num" w:pos="3600"/>
+        </w:tabs>
+        <w:ind w:left="3600" w:hanging="360"/>
+      </w:pPr>
+      <w:rPr>
+        <w:rFonts w:ascii="Wingdings" w:hAnsi="Wingdings" w:hint="default"/>
+        <w:sz w:val="20"/>
+      </w:rPr>
+    </w:lvl>
+    <w:lvl w:ilvl="5" w:tentative="1">
+      <w:start w:val="1"/>
+      <w:numFmt w:val="bullet"/>
+      <w:lvlText w:val=""/>
+      <w:lvlJc w:val="left"/>
+      <w:pPr>
+        <w:tabs>
+          <w:tab w:val="num" w:pos="4320"/>
+        </w:tabs>
+        <w:ind w:left="4320" w:hanging="360"/>
+      </w:pPr>
+      <w:rPr>
+        <w:rFonts w:ascii="Wingdings" w:hAnsi="Wingdings" w:hint="default"/>
+        <w:sz w:val="20"/>
+      </w:rPr>
+    </w:lvl>
+    <w:lvl w:ilvl="6" w:tentative="1">
+      <w:start w:val="1"/>
+      <w:numFmt w:val="bullet"/>
+      <w:lvlText w:val=""/>
+      <w:lvlJc w:val="left"/>
+      <w:pPr>
+        <w:tabs>
+          <w:tab w:val="num" w:pos="5040"/>
+        </w:tabs>
+        <w:ind w:left="5040" w:hanging="360"/>
+      </w:pPr>
+      <w:rPr>
+        <w:rFonts w:ascii="Wingdings" w:hAnsi="Wingdings" w:hint="default"/>
+        <w:sz w:val="20"/>
+      </w:rPr>
+    </w:lvl>
+    <w:lvl w:ilvl="7" w:tentative="1">
+      <w:start w:val="1"/>
+      <w:numFmt w:val="bullet"/>
+      <w:lvlText w:val=""/>
+      <w:lvlJc w:val="left"/>
+      <w:pPr>
+        <w:tabs>
+          <w:tab w:val="num" w:pos="5760"/>
+        </w:tabs>
+        <w:ind w:left="5760" w:hanging="360"/>
+      </w:pPr>
+      <w:rPr>
+        <w:rFonts w:ascii="Wingdings" w:hAnsi="Wingdings" w:hint="default"/>
+        <w:sz w:val="20"/>
+      </w:rPr>
+    </w:lvl>
+    <w:lvl w:ilvl="8" w:tentative="1">
+      <w:start w:val="1"/>
+      <w:numFmt w:val="bullet"/>
+      <w:lvlText w:val=""/>
+      <w:lvlJc w:val="left"/>
+      <w:pPr>
+        <w:tabs>
+          <w:tab w:val="num" w:pos="6480"/>
+        </w:tabs>
+        <w:ind w:left="6480" w:hanging="360"/>
+      </w:pPr>
+      <w:rPr>
+        <w:rFonts w:ascii="Wingdings" w:hAnsi="Wingdings" w:hint="default"/>
+        <w:sz w:val="20"/>
+      </w:rPr>
+    </w:lvl>
+  </w:abstractNum>
+  <w:abstractNum w:abstractNumId="11" w15:restartNumberingAfterBreak="0">
     <w:nsid w:val="2E953E8D"/>
     <w:multiLevelType w:val="multilevel"/>
     <w:tmpl w:val="D14E2D50"/>
@@ -3027,7 +4723,901 @@
       </w:rPr>
     </w:lvl>
   </w:abstractNum>
-  <w:abstractNum w:abstractNumId="6" w15:restartNumberingAfterBreak="0">
+  <w:abstractNum w:abstractNumId="12" w15:restartNumberingAfterBreak="0">
+    <w:nsid w:val="2EFA6901"/>
+    <w:multiLevelType w:val="multilevel"/>
+    <w:tmpl w:val="30688718"/>
+    <w:lvl w:ilvl="0">
+      <w:start w:val="1"/>
+      <w:numFmt w:val="bullet"/>
+      <w:lvlText w:val=""/>
+      <w:lvlJc w:val="left"/>
+      <w:pPr>
+        <w:tabs>
+          <w:tab w:val="num" w:pos="720"/>
+        </w:tabs>
+        <w:ind w:left="720" w:hanging="360"/>
+      </w:pPr>
+      <w:rPr>
+        <w:rFonts w:ascii="Symbol" w:hAnsi="Symbol" w:hint="default"/>
+        <w:sz w:val="20"/>
+      </w:rPr>
+    </w:lvl>
+    <w:lvl w:ilvl="1" w:tentative="1">
+      <w:start w:val="1"/>
+      <w:numFmt w:val="bullet"/>
+      <w:lvlText w:val="o"/>
+      <w:lvlJc w:val="left"/>
+      <w:pPr>
+        <w:tabs>
+          <w:tab w:val="num" w:pos="1440"/>
+        </w:tabs>
+        <w:ind w:left="1440" w:hanging="360"/>
+      </w:pPr>
+      <w:rPr>
+        <w:rFonts w:ascii="Courier New" w:hAnsi="Courier New" w:hint="default"/>
+        <w:sz w:val="20"/>
+      </w:rPr>
+    </w:lvl>
+    <w:lvl w:ilvl="2" w:tentative="1">
+      <w:start w:val="1"/>
+      <w:numFmt w:val="bullet"/>
+      <w:lvlText w:val=""/>
+      <w:lvlJc w:val="left"/>
+      <w:pPr>
+        <w:tabs>
+          <w:tab w:val="num" w:pos="2160"/>
+        </w:tabs>
+        <w:ind w:left="2160" w:hanging="360"/>
+      </w:pPr>
+      <w:rPr>
+        <w:rFonts w:ascii="Wingdings" w:hAnsi="Wingdings" w:hint="default"/>
+        <w:sz w:val="20"/>
+      </w:rPr>
+    </w:lvl>
+    <w:lvl w:ilvl="3" w:tentative="1">
+      <w:start w:val="1"/>
+      <w:numFmt w:val="bullet"/>
+      <w:lvlText w:val=""/>
+      <w:lvlJc w:val="left"/>
+      <w:pPr>
+        <w:tabs>
+          <w:tab w:val="num" w:pos="2880"/>
+        </w:tabs>
+        <w:ind w:left="2880" w:hanging="360"/>
+      </w:pPr>
+      <w:rPr>
+        <w:rFonts w:ascii="Wingdings" w:hAnsi="Wingdings" w:hint="default"/>
+        <w:sz w:val="20"/>
+      </w:rPr>
+    </w:lvl>
+    <w:lvl w:ilvl="4" w:tentative="1">
+      <w:start w:val="1"/>
+      <w:numFmt w:val="bullet"/>
+      <w:lvlText w:val=""/>
+      <w:lvlJc w:val="left"/>
+      <w:pPr>
+        <w:tabs>
+          <w:tab w:val="num" w:pos="3600"/>
+        </w:tabs>
+        <w:ind w:left="3600" w:hanging="360"/>
+      </w:pPr>
+      <w:rPr>
+        <w:rFonts w:ascii="Wingdings" w:hAnsi="Wingdings" w:hint="default"/>
+        <w:sz w:val="20"/>
+      </w:rPr>
+    </w:lvl>
+    <w:lvl w:ilvl="5" w:tentative="1">
+      <w:start w:val="1"/>
+      <w:numFmt w:val="bullet"/>
+      <w:lvlText w:val=""/>
+      <w:lvlJc w:val="left"/>
+      <w:pPr>
+        <w:tabs>
+          <w:tab w:val="num" w:pos="4320"/>
+        </w:tabs>
+        <w:ind w:left="4320" w:hanging="360"/>
+      </w:pPr>
+      <w:rPr>
+        <w:rFonts w:ascii="Wingdings" w:hAnsi="Wingdings" w:hint="default"/>
+        <w:sz w:val="20"/>
+      </w:rPr>
+    </w:lvl>
+    <w:lvl w:ilvl="6" w:tentative="1">
+      <w:start w:val="1"/>
+      <w:numFmt w:val="bullet"/>
+      <w:lvlText w:val=""/>
+      <w:lvlJc w:val="left"/>
+      <w:pPr>
+        <w:tabs>
+          <w:tab w:val="num" w:pos="5040"/>
+        </w:tabs>
+        <w:ind w:left="5040" w:hanging="360"/>
+      </w:pPr>
+      <w:rPr>
+        <w:rFonts w:ascii="Wingdings" w:hAnsi="Wingdings" w:hint="default"/>
+        <w:sz w:val="20"/>
+      </w:rPr>
+    </w:lvl>
+    <w:lvl w:ilvl="7" w:tentative="1">
+      <w:start w:val="1"/>
+      <w:numFmt w:val="bullet"/>
+      <w:lvlText w:val=""/>
+      <w:lvlJc w:val="left"/>
+      <w:pPr>
+        <w:tabs>
+          <w:tab w:val="num" w:pos="5760"/>
+        </w:tabs>
+        <w:ind w:left="5760" w:hanging="360"/>
+      </w:pPr>
+      <w:rPr>
+        <w:rFonts w:ascii="Wingdings" w:hAnsi="Wingdings" w:hint="default"/>
+        <w:sz w:val="20"/>
+      </w:rPr>
+    </w:lvl>
+    <w:lvl w:ilvl="8" w:tentative="1">
+      <w:start w:val="1"/>
+      <w:numFmt w:val="bullet"/>
+      <w:lvlText w:val=""/>
+      <w:lvlJc w:val="left"/>
+      <w:pPr>
+        <w:tabs>
+          <w:tab w:val="num" w:pos="6480"/>
+        </w:tabs>
+        <w:ind w:left="6480" w:hanging="360"/>
+      </w:pPr>
+      <w:rPr>
+        <w:rFonts w:ascii="Wingdings" w:hAnsi="Wingdings" w:hint="default"/>
+        <w:sz w:val="20"/>
+      </w:rPr>
+    </w:lvl>
+  </w:abstractNum>
+  <w:abstractNum w:abstractNumId="13" w15:restartNumberingAfterBreak="0">
+    <w:nsid w:val="34567D27"/>
+    <w:multiLevelType w:val="multilevel"/>
+    <w:tmpl w:val="44666E44"/>
+    <w:lvl w:ilvl="0">
+      <w:start w:val="1"/>
+      <w:numFmt w:val="bullet"/>
+      <w:lvlText w:val=""/>
+      <w:lvlJc w:val="left"/>
+      <w:pPr>
+        <w:tabs>
+          <w:tab w:val="num" w:pos="720"/>
+        </w:tabs>
+        <w:ind w:left="720" w:hanging="360"/>
+      </w:pPr>
+      <w:rPr>
+        <w:rFonts w:ascii="Symbol" w:hAnsi="Symbol" w:hint="default"/>
+        <w:sz w:val="20"/>
+      </w:rPr>
+    </w:lvl>
+    <w:lvl w:ilvl="1" w:tentative="1">
+      <w:start w:val="1"/>
+      <w:numFmt w:val="bullet"/>
+      <w:lvlText w:val="o"/>
+      <w:lvlJc w:val="left"/>
+      <w:pPr>
+        <w:tabs>
+          <w:tab w:val="num" w:pos="1440"/>
+        </w:tabs>
+        <w:ind w:left="1440" w:hanging="360"/>
+      </w:pPr>
+      <w:rPr>
+        <w:rFonts w:ascii="Courier New" w:hAnsi="Courier New" w:hint="default"/>
+        <w:sz w:val="20"/>
+      </w:rPr>
+    </w:lvl>
+    <w:lvl w:ilvl="2" w:tentative="1">
+      <w:start w:val="1"/>
+      <w:numFmt w:val="bullet"/>
+      <w:lvlText w:val=""/>
+      <w:lvlJc w:val="left"/>
+      <w:pPr>
+        <w:tabs>
+          <w:tab w:val="num" w:pos="2160"/>
+        </w:tabs>
+        <w:ind w:left="2160" w:hanging="360"/>
+      </w:pPr>
+      <w:rPr>
+        <w:rFonts w:ascii="Wingdings" w:hAnsi="Wingdings" w:hint="default"/>
+        <w:sz w:val="20"/>
+      </w:rPr>
+    </w:lvl>
+    <w:lvl w:ilvl="3" w:tentative="1">
+      <w:start w:val="1"/>
+      <w:numFmt w:val="bullet"/>
+      <w:lvlText w:val=""/>
+      <w:lvlJc w:val="left"/>
+      <w:pPr>
+        <w:tabs>
+          <w:tab w:val="num" w:pos="2880"/>
+        </w:tabs>
+        <w:ind w:left="2880" w:hanging="360"/>
+      </w:pPr>
+      <w:rPr>
+        <w:rFonts w:ascii="Wingdings" w:hAnsi="Wingdings" w:hint="default"/>
+        <w:sz w:val="20"/>
+      </w:rPr>
+    </w:lvl>
+    <w:lvl w:ilvl="4" w:tentative="1">
+      <w:start w:val="1"/>
+      <w:numFmt w:val="bullet"/>
+      <w:lvlText w:val=""/>
+      <w:lvlJc w:val="left"/>
+      <w:pPr>
+        <w:tabs>
+          <w:tab w:val="num" w:pos="3600"/>
+        </w:tabs>
+        <w:ind w:left="3600" w:hanging="360"/>
+      </w:pPr>
+      <w:rPr>
+        <w:rFonts w:ascii="Wingdings" w:hAnsi="Wingdings" w:hint="default"/>
+        <w:sz w:val="20"/>
+      </w:rPr>
+    </w:lvl>
+    <w:lvl w:ilvl="5" w:tentative="1">
+      <w:start w:val="1"/>
+      <w:numFmt w:val="bullet"/>
+      <w:lvlText w:val=""/>
+      <w:lvlJc w:val="left"/>
+      <w:pPr>
+        <w:tabs>
+          <w:tab w:val="num" w:pos="4320"/>
+        </w:tabs>
+        <w:ind w:left="4320" w:hanging="360"/>
+      </w:pPr>
+      <w:rPr>
+        <w:rFonts w:ascii="Wingdings" w:hAnsi="Wingdings" w:hint="default"/>
+        <w:sz w:val="20"/>
+      </w:rPr>
+    </w:lvl>
+    <w:lvl w:ilvl="6" w:tentative="1">
+      <w:start w:val="1"/>
+      <w:numFmt w:val="bullet"/>
+      <w:lvlText w:val=""/>
+      <w:lvlJc w:val="left"/>
+      <w:pPr>
+        <w:tabs>
+          <w:tab w:val="num" w:pos="5040"/>
+        </w:tabs>
+        <w:ind w:left="5040" w:hanging="360"/>
+      </w:pPr>
+      <w:rPr>
+        <w:rFonts w:ascii="Wingdings" w:hAnsi="Wingdings" w:hint="default"/>
+        <w:sz w:val="20"/>
+      </w:rPr>
+    </w:lvl>
+    <w:lvl w:ilvl="7" w:tentative="1">
+      <w:start w:val="1"/>
+      <w:numFmt w:val="bullet"/>
+      <w:lvlText w:val=""/>
+      <w:lvlJc w:val="left"/>
+      <w:pPr>
+        <w:tabs>
+          <w:tab w:val="num" w:pos="5760"/>
+        </w:tabs>
+        <w:ind w:left="5760" w:hanging="360"/>
+      </w:pPr>
+      <w:rPr>
+        <w:rFonts w:ascii="Wingdings" w:hAnsi="Wingdings" w:hint="default"/>
+        <w:sz w:val="20"/>
+      </w:rPr>
+    </w:lvl>
+    <w:lvl w:ilvl="8" w:tentative="1">
+      <w:start w:val="1"/>
+      <w:numFmt w:val="bullet"/>
+      <w:lvlText w:val=""/>
+      <w:lvlJc w:val="left"/>
+      <w:pPr>
+        <w:tabs>
+          <w:tab w:val="num" w:pos="6480"/>
+        </w:tabs>
+        <w:ind w:left="6480" w:hanging="360"/>
+      </w:pPr>
+      <w:rPr>
+        <w:rFonts w:ascii="Wingdings" w:hAnsi="Wingdings" w:hint="default"/>
+        <w:sz w:val="20"/>
+      </w:rPr>
+    </w:lvl>
+  </w:abstractNum>
+  <w:abstractNum w:abstractNumId="14" w15:restartNumberingAfterBreak="0">
+    <w:nsid w:val="34EB6866"/>
+    <w:multiLevelType w:val="multilevel"/>
+    <w:tmpl w:val="9F5E4904"/>
+    <w:lvl w:ilvl="0">
+      <w:start w:val="1"/>
+      <w:numFmt w:val="bullet"/>
+      <w:lvlText w:val=""/>
+      <w:lvlJc w:val="left"/>
+      <w:pPr>
+        <w:tabs>
+          <w:tab w:val="num" w:pos="720"/>
+        </w:tabs>
+        <w:ind w:left="720" w:hanging="360"/>
+      </w:pPr>
+      <w:rPr>
+        <w:rFonts w:ascii="Symbol" w:hAnsi="Symbol" w:hint="default"/>
+        <w:sz w:val="20"/>
+      </w:rPr>
+    </w:lvl>
+    <w:lvl w:ilvl="1" w:tentative="1">
+      <w:start w:val="1"/>
+      <w:numFmt w:val="bullet"/>
+      <w:lvlText w:val="o"/>
+      <w:lvlJc w:val="left"/>
+      <w:pPr>
+        <w:tabs>
+          <w:tab w:val="num" w:pos="1440"/>
+        </w:tabs>
+        <w:ind w:left="1440" w:hanging="360"/>
+      </w:pPr>
+      <w:rPr>
+        <w:rFonts w:ascii="Courier New" w:hAnsi="Courier New" w:hint="default"/>
+        <w:sz w:val="20"/>
+      </w:rPr>
+    </w:lvl>
+    <w:lvl w:ilvl="2" w:tentative="1">
+      <w:start w:val="1"/>
+      <w:numFmt w:val="bullet"/>
+      <w:lvlText w:val=""/>
+      <w:lvlJc w:val="left"/>
+      <w:pPr>
+        <w:tabs>
+          <w:tab w:val="num" w:pos="2160"/>
+        </w:tabs>
+        <w:ind w:left="2160" w:hanging="360"/>
+      </w:pPr>
+      <w:rPr>
+        <w:rFonts w:ascii="Wingdings" w:hAnsi="Wingdings" w:hint="default"/>
+        <w:sz w:val="20"/>
+      </w:rPr>
+    </w:lvl>
+    <w:lvl w:ilvl="3" w:tentative="1">
+      <w:start w:val="1"/>
+      <w:numFmt w:val="bullet"/>
+      <w:lvlText w:val=""/>
+      <w:lvlJc w:val="left"/>
+      <w:pPr>
+        <w:tabs>
+          <w:tab w:val="num" w:pos="2880"/>
+        </w:tabs>
+        <w:ind w:left="2880" w:hanging="360"/>
+      </w:pPr>
+      <w:rPr>
+        <w:rFonts w:ascii="Wingdings" w:hAnsi="Wingdings" w:hint="default"/>
+        <w:sz w:val="20"/>
+      </w:rPr>
+    </w:lvl>
+    <w:lvl w:ilvl="4" w:tentative="1">
+      <w:start w:val="1"/>
+      <w:numFmt w:val="bullet"/>
+      <w:lvlText w:val=""/>
+      <w:lvlJc w:val="left"/>
+      <w:pPr>
+        <w:tabs>
+          <w:tab w:val="num" w:pos="3600"/>
+        </w:tabs>
+        <w:ind w:left="3600" w:hanging="360"/>
+      </w:pPr>
+      <w:rPr>
+        <w:rFonts w:ascii="Wingdings" w:hAnsi="Wingdings" w:hint="default"/>
+        <w:sz w:val="20"/>
+      </w:rPr>
+    </w:lvl>
+    <w:lvl w:ilvl="5" w:tentative="1">
+      <w:start w:val="1"/>
+      <w:numFmt w:val="bullet"/>
+      <w:lvlText w:val=""/>
+      <w:lvlJc w:val="left"/>
+      <w:pPr>
+        <w:tabs>
+          <w:tab w:val="num" w:pos="4320"/>
+        </w:tabs>
+        <w:ind w:left="4320" w:hanging="360"/>
+      </w:pPr>
+      <w:rPr>
+        <w:rFonts w:ascii="Wingdings" w:hAnsi="Wingdings" w:hint="default"/>
+        <w:sz w:val="20"/>
+      </w:rPr>
+    </w:lvl>
+    <w:lvl w:ilvl="6" w:tentative="1">
+      <w:start w:val="1"/>
+      <w:numFmt w:val="bullet"/>
+      <w:lvlText w:val=""/>
+      <w:lvlJc w:val="left"/>
+      <w:pPr>
+        <w:tabs>
+          <w:tab w:val="num" w:pos="5040"/>
+        </w:tabs>
+        <w:ind w:left="5040" w:hanging="360"/>
+      </w:pPr>
+      <w:rPr>
+        <w:rFonts w:ascii="Wingdings" w:hAnsi="Wingdings" w:hint="default"/>
+        <w:sz w:val="20"/>
+      </w:rPr>
+    </w:lvl>
+    <w:lvl w:ilvl="7" w:tentative="1">
+      <w:start w:val="1"/>
+      <w:numFmt w:val="bullet"/>
+      <w:lvlText w:val=""/>
+      <w:lvlJc w:val="left"/>
+      <w:pPr>
+        <w:tabs>
+          <w:tab w:val="num" w:pos="5760"/>
+        </w:tabs>
+        <w:ind w:left="5760" w:hanging="360"/>
+      </w:pPr>
+      <w:rPr>
+        <w:rFonts w:ascii="Wingdings" w:hAnsi="Wingdings" w:hint="default"/>
+        <w:sz w:val="20"/>
+      </w:rPr>
+    </w:lvl>
+    <w:lvl w:ilvl="8" w:tentative="1">
+      <w:start w:val="1"/>
+      <w:numFmt w:val="bullet"/>
+      <w:lvlText w:val=""/>
+      <w:lvlJc w:val="left"/>
+      <w:pPr>
+        <w:tabs>
+          <w:tab w:val="num" w:pos="6480"/>
+        </w:tabs>
+        <w:ind w:left="6480" w:hanging="360"/>
+      </w:pPr>
+      <w:rPr>
+        <w:rFonts w:ascii="Wingdings" w:hAnsi="Wingdings" w:hint="default"/>
+        <w:sz w:val="20"/>
+      </w:rPr>
+    </w:lvl>
+  </w:abstractNum>
+  <w:abstractNum w:abstractNumId="15" w15:restartNumberingAfterBreak="0">
+    <w:nsid w:val="35ED047E"/>
+    <w:multiLevelType w:val="multilevel"/>
+    <w:tmpl w:val="1C58DF52"/>
+    <w:lvl w:ilvl="0">
+      <w:start w:val="1"/>
+      <w:numFmt w:val="bullet"/>
+      <w:lvlText w:val=""/>
+      <w:lvlJc w:val="left"/>
+      <w:pPr>
+        <w:tabs>
+          <w:tab w:val="num" w:pos="720"/>
+        </w:tabs>
+        <w:ind w:left="720" w:hanging="360"/>
+      </w:pPr>
+      <w:rPr>
+        <w:rFonts w:ascii="Symbol" w:hAnsi="Symbol" w:hint="default"/>
+        <w:sz w:val="20"/>
+      </w:rPr>
+    </w:lvl>
+    <w:lvl w:ilvl="1" w:tentative="1">
+      <w:start w:val="1"/>
+      <w:numFmt w:val="bullet"/>
+      <w:lvlText w:val="o"/>
+      <w:lvlJc w:val="left"/>
+      <w:pPr>
+        <w:tabs>
+          <w:tab w:val="num" w:pos="1440"/>
+        </w:tabs>
+        <w:ind w:left="1440" w:hanging="360"/>
+      </w:pPr>
+      <w:rPr>
+        <w:rFonts w:ascii="Courier New" w:hAnsi="Courier New" w:hint="default"/>
+        <w:sz w:val="20"/>
+      </w:rPr>
+    </w:lvl>
+    <w:lvl w:ilvl="2" w:tentative="1">
+      <w:start w:val="1"/>
+      <w:numFmt w:val="bullet"/>
+      <w:lvlText w:val=""/>
+      <w:lvlJc w:val="left"/>
+      <w:pPr>
+        <w:tabs>
+          <w:tab w:val="num" w:pos="2160"/>
+        </w:tabs>
+        <w:ind w:left="2160" w:hanging="360"/>
+      </w:pPr>
+      <w:rPr>
+        <w:rFonts w:ascii="Wingdings" w:hAnsi="Wingdings" w:hint="default"/>
+        <w:sz w:val="20"/>
+      </w:rPr>
+    </w:lvl>
+    <w:lvl w:ilvl="3" w:tentative="1">
+      <w:start w:val="1"/>
+      <w:numFmt w:val="bullet"/>
+      <w:lvlText w:val=""/>
+      <w:lvlJc w:val="left"/>
+      <w:pPr>
+        <w:tabs>
+          <w:tab w:val="num" w:pos="2880"/>
+        </w:tabs>
+        <w:ind w:left="2880" w:hanging="360"/>
+      </w:pPr>
+      <w:rPr>
+        <w:rFonts w:ascii="Wingdings" w:hAnsi="Wingdings" w:hint="default"/>
+        <w:sz w:val="20"/>
+      </w:rPr>
+    </w:lvl>
+    <w:lvl w:ilvl="4" w:tentative="1">
+      <w:start w:val="1"/>
+      <w:numFmt w:val="bullet"/>
+      <w:lvlText w:val=""/>
+      <w:lvlJc w:val="left"/>
+      <w:pPr>
+        <w:tabs>
+          <w:tab w:val="num" w:pos="3600"/>
+        </w:tabs>
+        <w:ind w:left="3600" w:hanging="360"/>
+      </w:pPr>
+      <w:rPr>
+        <w:rFonts w:ascii="Wingdings" w:hAnsi="Wingdings" w:hint="default"/>
+        <w:sz w:val="20"/>
+      </w:rPr>
+    </w:lvl>
+    <w:lvl w:ilvl="5" w:tentative="1">
+      <w:start w:val="1"/>
+      <w:numFmt w:val="bullet"/>
+      <w:lvlText w:val=""/>
+      <w:lvlJc w:val="left"/>
+      <w:pPr>
+        <w:tabs>
+          <w:tab w:val="num" w:pos="4320"/>
+        </w:tabs>
+        <w:ind w:left="4320" w:hanging="360"/>
+      </w:pPr>
+      <w:rPr>
+        <w:rFonts w:ascii="Wingdings" w:hAnsi="Wingdings" w:hint="default"/>
+        <w:sz w:val="20"/>
+      </w:rPr>
+    </w:lvl>
+    <w:lvl w:ilvl="6" w:tentative="1">
+      <w:start w:val="1"/>
+      <w:numFmt w:val="bullet"/>
+      <w:lvlText w:val=""/>
+      <w:lvlJc w:val="left"/>
+      <w:pPr>
+        <w:tabs>
+          <w:tab w:val="num" w:pos="5040"/>
+        </w:tabs>
+        <w:ind w:left="5040" w:hanging="360"/>
+      </w:pPr>
+      <w:rPr>
+        <w:rFonts w:ascii="Wingdings" w:hAnsi="Wingdings" w:hint="default"/>
+        <w:sz w:val="20"/>
+      </w:rPr>
+    </w:lvl>
+    <w:lvl w:ilvl="7" w:tentative="1">
+      <w:start w:val="1"/>
+      <w:numFmt w:val="bullet"/>
+      <w:lvlText w:val=""/>
+      <w:lvlJc w:val="left"/>
+      <w:pPr>
+        <w:tabs>
+          <w:tab w:val="num" w:pos="5760"/>
+        </w:tabs>
+        <w:ind w:left="5760" w:hanging="360"/>
+      </w:pPr>
+      <w:rPr>
+        <w:rFonts w:ascii="Wingdings" w:hAnsi="Wingdings" w:hint="default"/>
+        <w:sz w:val="20"/>
+      </w:rPr>
+    </w:lvl>
+    <w:lvl w:ilvl="8" w:tentative="1">
+      <w:start w:val="1"/>
+      <w:numFmt w:val="bullet"/>
+      <w:lvlText w:val=""/>
+      <w:lvlJc w:val="left"/>
+      <w:pPr>
+        <w:tabs>
+          <w:tab w:val="num" w:pos="6480"/>
+        </w:tabs>
+        <w:ind w:left="6480" w:hanging="360"/>
+      </w:pPr>
+      <w:rPr>
+        <w:rFonts w:ascii="Wingdings" w:hAnsi="Wingdings" w:hint="default"/>
+        <w:sz w:val="20"/>
+      </w:rPr>
+    </w:lvl>
+  </w:abstractNum>
+  <w:abstractNum w:abstractNumId="16" w15:restartNumberingAfterBreak="0">
+    <w:nsid w:val="3E9A603F"/>
+    <w:multiLevelType w:val="multilevel"/>
+    <w:tmpl w:val="569621C8"/>
+    <w:lvl w:ilvl="0">
+      <w:start w:val="1"/>
+      <w:numFmt w:val="bullet"/>
+      <w:lvlText w:val=""/>
+      <w:lvlJc w:val="left"/>
+      <w:pPr>
+        <w:tabs>
+          <w:tab w:val="num" w:pos="720"/>
+        </w:tabs>
+        <w:ind w:left="720" w:hanging="360"/>
+      </w:pPr>
+      <w:rPr>
+        <w:rFonts w:ascii="Symbol" w:hAnsi="Symbol" w:hint="default"/>
+        <w:sz w:val="20"/>
+      </w:rPr>
+    </w:lvl>
+    <w:lvl w:ilvl="1" w:tentative="1">
+      <w:start w:val="1"/>
+      <w:numFmt w:val="bullet"/>
+      <w:lvlText w:val="o"/>
+      <w:lvlJc w:val="left"/>
+      <w:pPr>
+        <w:tabs>
+          <w:tab w:val="num" w:pos="1440"/>
+        </w:tabs>
+        <w:ind w:left="1440" w:hanging="360"/>
+      </w:pPr>
+      <w:rPr>
+        <w:rFonts w:ascii="Courier New" w:hAnsi="Courier New" w:hint="default"/>
+        <w:sz w:val="20"/>
+      </w:rPr>
+    </w:lvl>
+    <w:lvl w:ilvl="2" w:tentative="1">
+      <w:start w:val="1"/>
+      <w:numFmt w:val="bullet"/>
+      <w:lvlText w:val=""/>
+      <w:lvlJc w:val="left"/>
+      <w:pPr>
+        <w:tabs>
+          <w:tab w:val="num" w:pos="2160"/>
+        </w:tabs>
+        <w:ind w:left="2160" w:hanging="360"/>
+      </w:pPr>
+      <w:rPr>
+        <w:rFonts w:ascii="Wingdings" w:hAnsi="Wingdings" w:hint="default"/>
+        <w:sz w:val="20"/>
+      </w:rPr>
+    </w:lvl>
+    <w:lvl w:ilvl="3" w:tentative="1">
+      <w:start w:val="1"/>
+      <w:numFmt w:val="bullet"/>
+      <w:lvlText w:val=""/>
+      <w:lvlJc w:val="left"/>
+      <w:pPr>
+        <w:tabs>
+          <w:tab w:val="num" w:pos="2880"/>
+        </w:tabs>
+        <w:ind w:left="2880" w:hanging="360"/>
+      </w:pPr>
+      <w:rPr>
+        <w:rFonts w:ascii="Wingdings" w:hAnsi="Wingdings" w:hint="default"/>
+        <w:sz w:val="20"/>
+      </w:rPr>
+    </w:lvl>
+    <w:lvl w:ilvl="4" w:tentative="1">
+      <w:start w:val="1"/>
+      <w:numFmt w:val="bullet"/>
+      <w:lvlText w:val=""/>
+      <w:lvlJc w:val="left"/>
+      <w:pPr>
+        <w:tabs>
+          <w:tab w:val="num" w:pos="3600"/>
+        </w:tabs>
+        <w:ind w:left="3600" w:hanging="360"/>
+      </w:pPr>
+      <w:rPr>
+        <w:rFonts w:ascii="Wingdings" w:hAnsi="Wingdings" w:hint="default"/>
+        <w:sz w:val="20"/>
+      </w:rPr>
+    </w:lvl>
+    <w:lvl w:ilvl="5" w:tentative="1">
+      <w:start w:val="1"/>
+      <w:numFmt w:val="bullet"/>
+      <w:lvlText w:val=""/>
+      <w:lvlJc w:val="left"/>
+      <w:pPr>
+        <w:tabs>
+          <w:tab w:val="num" w:pos="4320"/>
+        </w:tabs>
+        <w:ind w:left="4320" w:hanging="360"/>
+      </w:pPr>
+      <w:rPr>
+        <w:rFonts w:ascii="Wingdings" w:hAnsi="Wingdings" w:hint="default"/>
+        <w:sz w:val="20"/>
+      </w:rPr>
+    </w:lvl>
+    <w:lvl w:ilvl="6" w:tentative="1">
+      <w:start w:val="1"/>
+      <w:numFmt w:val="bullet"/>
+      <w:lvlText w:val=""/>
+      <w:lvlJc w:val="left"/>
+      <w:pPr>
+        <w:tabs>
+          <w:tab w:val="num" w:pos="5040"/>
+        </w:tabs>
+        <w:ind w:left="5040" w:hanging="360"/>
+      </w:pPr>
+      <w:rPr>
+        <w:rFonts w:ascii="Wingdings" w:hAnsi="Wingdings" w:hint="default"/>
+        <w:sz w:val="20"/>
+      </w:rPr>
+    </w:lvl>
+    <w:lvl w:ilvl="7" w:tentative="1">
+      <w:start w:val="1"/>
+      <w:numFmt w:val="bullet"/>
+      <w:lvlText w:val=""/>
+      <w:lvlJc w:val="left"/>
+      <w:pPr>
+        <w:tabs>
+          <w:tab w:val="num" w:pos="5760"/>
+        </w:tabs>
+        <w:ind w:left="5760" w:hanging="360"/>
+      </w:pPr>
+      <w:rPr>
+        <w:rFonts w:ascii="Wingdings" w:hAnsi="Wingdings" w:hint="default"/>
+        <w:sz w:val="20"/>
+      </w:rPr>
+    </w:lvl>
+    <w:lvl w:ilvl="8" w:tentative="1">
+      <w:start w:val="1"/>
+      <w:numFmt w:val="bullet"/>
+      <w:lvlText w:val=""/>
+      <w:lvlJc w:val="left"/>
+      <w:pPr>
+        <w:tabs>
+          <w:tab w:val="num" w:pos="6480"/>
+        </w:tabs>
+        <w:ind w:left="6480" w:hanging="360"/>
+      </w:pPr>
+      <w:rPr>
+        <w:rFonts w:ascii="Wingdings" w:hAnsi="Wingdings" w:hint="default"/>
+        <w:sz w:val="20"/>
+      </w:rPr>
+    </w:lvl>
+  </w:abstractNum>
+  <w:abstractNum w:abstractNumId="17" w15:restartNumberingAfterBreak="0">
+    <w:nsid w:val="406F115C"/>
+    <w:multiLevelType w:val="multilevel"/>
+    <w:tmpl w:val="6AF6F940"/>
+    <w:lvl w:ilvl="0">
+      <w:start w:val="1"/>
+      <w:numFmt w:val="bullet"/>
+      <w:lvlText w:val=""/>
+      <w:lvlJc w:val="left"/>
+      <w:pPr>
+        <w:tabs>
+          <w:tab w:val="num" w:pos="720"/>
+        </w:tabs>
+        <w:ind w:left="720" w:hanging="360"/>
+      </w:pPr>
+      <w:rPr>
+        <w:rFonts w:ascii="Symbol" w:hAnsi="Symbol" w:hint="default"/>
+        <w:sz w:val="20"/>
+      </w:rPr>
+    </w:lvl>
+    <w:lvl w:ilvl="1" w:tentative="1">
+      <w:start w:val="1"/>
+      <w:numFmt w:val="bullet"/>
+      <w:lvlText w:val="o"/>
+      <w:lvlJc w:val="left"/>
+      <w:pPr>
+        <w:tabs>
+          <w:tab w:val="num" w:pos="1440"/>
+        </w:tabs>
+        <w:ind w:left="1440" w:hanging="360"/>
+      </w:pPr>
+      <w:rPr>
+        <w:rFonts w:ascii="Courier New" w:hAnsi="Courier New" w:hint="default"/>
+        <w:sz w:val="20"/>
+      </w:rPr>
+    </w:lvl>
+    <w:lvl w:ilvl="2" w:tentative="1">
+      <w:start w:val="1"/>
+      <w:numFmt w:val="bullet"/>
+      <w:lvlText w:val=""/>
+      <w:lvlJc w:val="left"/>
+      <w:pPr>
+        <w:tabs>
+          <w:tab w:val="num" w:pos="2160"/>
+        </w:tabs>
+        <w:ind w:left="2160" w:hanging="360"/>
+      </w:pPr>
+      <w:rPr>
+        <w:rFonts w:ascii="Wingdings" w:hAnsi="Wingdings" w:hint="default"/>
+        <w:sz w:val="20"/>
+      </w:rPr>
+    </w:lvl>
+    <w:lvl w:ilvl="3" w:tentative="1">
+      <w:start w:val="1"/>
+      <w:numFmt w:val="bullet"/>
+      <w:lvlText w:val=""/>
+      <w:lvlJc w:val="left"/>
+      <w:pPr>
+        <w:tabs>
+          <w:tab w:val="num" w:pos="2880"/>
+        </w:tabs>
+        <w:ind w:left="2880" w:hanging="360"/>
+      </w:pPr>
+      <w:rPr>
+        <w:rFonts w:ascii="Wingdings" w:hAnsi="Wingdings" w:hint="default"/>
+        <w:sz w:val="20"/>
+      </w:rPr>
+    </w:lvl>
+    <w:lvl w:ilvl="4" w:tentative="1">
+      <w:start w:val="1"/>
+      <w:numFmt w:val="bullet"/>
+      <w:lvlText w:val=""/>
+      <w:lvlJc w:val="left"/>
+      <w:pPr>
+        <w:tabs>
+          <w:tab w:val="num" w:pos="3600"/>
+        </w:tabs>
+        <w:ind w:left="3600" w:hanging="360"/>
+      </w:pPr>
+      <w:rPr>
+        <w:rFonts w:ascii="Wingdings" w:hAnsi="Wingdings" w:hint="default"/>
+        <w:sz w:val="20"/>
+      </w:rPr>
+    </w:lvl>
+    <w:lvl w:ilvl="5" w:tentative="1">
+      <w:start w:val="1"/>
+      <w:numFmt w:val="bullet"/>
+      <w:lvlText w:val=""/>
+      <w:lvlJc w:val="left"/>
+      <w:pPr>
+        <w:tabs>
+          <w:tab w:val="num" w:pos="4320"/>
+        </w:tabs>
+        <w:ind w:left="4320" w:hanging="360"/>
+      </w:pPr>
+      <w:rPr>
+        <w:rFonts w:ascii="Wingdings" w:hAnsi="Wingdings" w:hint="default"/>
+        <w:sz w:val="20"/>
+      </w:rPr>
+    </w:lvl>
+    <w:lvl w:ilvl="6" w:tentative="1">
+      <w:start w:val="1"/>
+      <w:numFmt w:val="bullet"/>
+      <w:lvlText w:val=""/>
+      <w:lvlJc w:val="left"/>
+      <w:pPr>
+        <w:tabs>
+          <w:tab w:val="num" w:pos="5040"/>
+        </w:tabs>
+        <w:ind w:left="5040" w:hanging="360"/>
+      </w:pPr>
+      <w:rPr>
+        <w:rFonts w:ascii="Wingdings" w:hAnsi="Wingdings" w:hint="default"/>
+        <w:sz w:val="20"/>
+      </w:rPr>
+    </w:lvl>
+    <w:lvl w:ilvl="7" w:tentative="1">
+      <w:start w:val="1"/>
+      <w:numFmt w:val="bullet"/>
+      <w:lvlText w:val=""/>
+      <w:lvlJc w:val="left"/>
+      <w:pPr>
+        <w:tabs>
+          <w:tab w:val="num" w:pos="5760"/>
+        </w:tabs>
+        <w:ind w:left="5760" w:hanging="360"/>
+      </w:pPr>
+      <w:rPr>
+        <w:rFonts w:ascii="Wingdings" w:hAnsi="Wingdings" w:hint="default"/>
+        <w:sz w:val="20"/>
+      </w:rPr>
+    </w:lvl>
+    <w:lvl w:ilvl="8" w:tentative="1">
+      <w:start w:val="1"/>
+      <w:numFmt w:val="bullet"/>
+      <w:lvlText w:val=""/>
+      <w:lvlJc w:val="left"/>
+      <w:pPr>
+        <w:tabs>
+          <w:tab w:val="num" w:pos="6480"/>
+        </w:tabs>
+        <w:ind w:left="6480" w:hanging="360"/>
+      </w:pPr>
+      <w:rPr>
+        <w:rFonts w:ascii="Wingdings" w:hAnsi="Wingdings" w:hint="default"/>
+        <w:sz w:val="20"/>
+      </w:rPr>
+    </w:lvl>
+  </w:abstractNum>
+  <w:abstractNum w:abstractNumId="18" w15:restartNumberingAfterBreak="0">
     <w:nsid w:val="44182051"/>
     <w:multiLevelType w:val="multilevel"/>
     <w:tmpl w:val="E8CEA920"/>
@@ -3176,7 +5766,7 @@
       </w:rPr>
     </w:lvl>
   </w:abstractNum>
-  <w:abstractNum w:abstractNumId="7" w15:restartNumberingAfterBreak="0">
+  <w:abstractNum w:abstractNumId="19" w15:restartNumberingAfterBreak="0">
     <w:nsid w:val="48DD7D8A"/>
     <w:multiLevelType w:val="multilevel"/>
     <w:tmpl w:val="F7DC3E14"/>
@@ -3325,7 +5915,7 @@
       </w:rPr>
     </w:lvl>
   </w:abstractNum>
-  <w:abstractNum w:abstractNumId="8" w15:restartNumberingAfterBreak="0">
+  <w:abstractNum w:abstractNumId="20" w15:restartNumberingAfterBreak="0">
     <w:nsid w:val="4BF9605E"/>
     <w:multiLevelType w:val="multilevel"/>
     <w:tmpl w:val="A2D8D436"/>
@@ -3474,7 +6064,454 @@
       </w:rPr>
     </w:lvl>
   </w:abstractNum>
-  <w:abstractNum w:abstractNumId="9" w15:restartNumberingAfterBreak="0">
+  <w:abstractNum w:abstractNumId="21" w15:restartNumberingAfterBreak="0">
+    <w:nsid w:val="5F2E3BBF"/>
+    <w:multiLevelType w:val="multilevel"/>
+    <w:tmpl w:val="BAAE37FC"/>
+    <w:lvl w:ilvl="0">
+      <w:start w:val="1"/>
+      <w:numFmt w:val="bullet"/>
+      <w:lvlText w:val=""/>
+      <w:lvlJc w:val="left"/>
+      <w:pPr>
+        <w:tabs>
+          <w:tab w:val="num" w:pos="720"/>
+        </w:tabs>
+        <w:ind w:left="720" w:hanging="360"/>
+      </w:pPr>
+      <w:rPr>
+        <w:rFonts w:ascii="Symbol" w:hAnsi="Symbol" w:hint="default"/>
+        <w:sz w:val="20"/>
+      </w:rPr>
+    </w:lvl>
+    <w:lvl w:ilvl="1" w:tentative="1">
+      <w:start w:val="1"/>
+      <w:numFmt w:val="bullet"/>
+      <w:lvlText w:val="o"/>
+      <w:lvlJc w:val="left"/>
+      <w:pPr>
+        <w:tabs>
+          <w:tab w:val="num" w:pos="1440"/>
+        </w:tabs>
+        <w:ind w:left="1440" w:hanging="360"/>
+      </w:pPr>
+      <w:rPr>
+        <w:rFonts w:ascii="Courier New" w:hAnsi="Courier New" w:hint="default"/>
+        <w:sz w:val="20"/>
+      </w:rPr>
+    </w:lvl>
+    <w:lvl w:ilvl="2" w:tentative="1">
+      <w:start w:val="1"/>
+      <w:numFmt w:val="bullet"/>
+      <w:lvlText w:val=""/>
+      <w:lvlJc w:val="left"/>
+      <w:pPr>
+        <w:tabs>
+          <w:tab w:val="num" w:pos="2160"/>
+        </w:tabs>
+        <w:ind w:left="2160" w:hanging="360"/>
+      </w:pPr>
+      <w:rPr>
+        <w:rFonts w:ascii="Wingdings" w:hAnsi="Wingdings" w:hint="default"/>
+        <w:sz w:val="20"/>
+      </w:rPr>
+    </w:lvl>
+    <w:lvl w:ilvl="3" w:tentative="1">
+      <w:start w:val="1"/>
+      <w:numFmt w:val="bullet"/>
+      <w:lvlText w:val=""/>
+      <w:lvlJc w:val="left"/>
+      <w:pPr>
+        <w:tabs>
+          <w:tab w:val="num" w:pos="2880"/>
+        </w:tabs>
+        <w:ind w:left="2880" w:hanging="360"/>
+      </w:pPr>
+      <w:rPr>
+        <w:rFonts w:ascii="Wingdings" w:hAnsi="Wingdings" w:hint="default"/>
+        <w:sz w:val="20"/>
+      </w:rPr>
+    </w:lvl>
+    <w:lvl w:ilvl="4" w:tentative="1">
+      <w:start w:val="1"/>
+      <w:numFmt w:val="bullet"/>
+      <w:lvlText w:val=""/>
+      <w:lvlJc w:val="left"/>
+      <w:pPr>
+        <w:tabs>
+          <w:tab w:val="num" w:pos="3600"/>
+        </w:tabs>
+        <w:ind w:left="3600" w:hanging="360"/>
+      </w:pPr>
+      <w:rPr>
+        <w:rFonts w:ascii="Wingdings" w:hAnsi="Wingdings" w:hint="default"/>
+        <w:sz w:val="20"/>
+      </w:rPr>
+    </w:lvl>
+    <w:lvl w:ilvl="5" w:tentative="1">
+      <w:start w:val="1"/>
+      <w:numFmt w:val="bullet"/>
+      <w:lvlText w:val=""/>
+      <w:lvlJc w:val="left"/>
+      <w:pPr>
+        <w:tabs>
+          <w:tab w:val="num" w:pos="4320"/>
+        </w:tabs>
+        <w:ind w:left="4320" w:hanging="360"/>
+      </w:pPr>
+      <w:rPr>
+        <w:rFonts w:ascii="Wingdings" w:hAnsi="Wingdings" w:hint="default"/>
+        <w:sz w:val="20"/>
+      </w:rPr>
+    </w:lvl>
+    <w:lvl w:ilvl="6" w:tentative="1">
+      <w:start w:val="1"/>
+      <w:numFmt w:val="bullet"/>
+      <w:lvlText w:val=""/>
+      <w:lvlJc w:val="left"/>
+      <w:pPr>
+        <w:tabs>
+          <w:tab w:val="num" w:pos="5040"/>
+        </w:tabs>
+        <w:ind w:left="5040" w:hanging="360"/>
+      </w:pPr>
+      <w:rPr>
+        <w:rFonts w:ascii="Wingdings" w:hAnsi="Wingdings" w:hint="default"/>
+        <w:sz w:val="20"/>
+      </w:rPr>
+    </w:lvl>
+    <w:lvl w:ilvl="7" w:tentative="1">
+      <w:start w:val="1"/>
+      <w:numFmt w:val="bullet"/>
+      <w:lvlText w:val=""/>
+      <w:lvlJc w:val="left"/>
+      <w:pPr>
+        <w:tabs>
+          <w:tab w:val="num" w:pos="5760"/>
+        </w:tabs>
+        <w:ind w:left="5760" w:hanging="360"/>
+      </w:pPr>
+      <w:rPr>
+        <w:rFonts w:ascii="Wingdings" w:hAnsi="Wingdings" w:hint="default"/>
+        <w:sz w:val="20"/>
+      </w:rPr>
+    </w:lvl>
+    <w:lvl w:ilvl="8" w:tentative="1">
+      <w:start w:val="1"/>
+      <w:numFmt w:val="bullet"/>
+      <w:lvlText w:val=""/>
+      <w:lvlJc w:val="left"/>
+      <w:pPr>
+        <w:tabs>
+          <w:tab w:val="num" w:pos="6480"/>
+        </w:tabs>
+        <w:ind w:left="6480" w:hanging="360"/>
+      </w:pPr>
+      <w:rPr>
+        <w:rFonts w:ascii="Wingdings" w:hAnsi="Wingdings" w:hint="default"/>
+        <w:sz w:val="20"/>
+      </w:rPr>
+    </w:lvl>
+  </w:abstractNum>
+  <w:abstractNum w:abstractNumId="22" w15:restartNumberingAfterBreak="0">
+    <w:nsid w:val="5F452812"/>
+    <w:multiLevelType w:val="multilevel"/>
+    <w:tmpl w:val="E5B02050"/>
+    <w:lvl w:ilvl="0">
+      <w:start w:val="1"/>
+      <w:numFmt w:val="bullet"/>
+      <w:lvlText w:val=""/>
+      <w:lvlJc w:val="left"/>
+      <w:pPr>
+        <w:tabs>
+          <w:tab w:val="num" w:pos="720"/>
+        </w:tabs>
+        <w:ind w:left="720" w:hanging="360"/>
+      </w:pPr>
+      <w:rPr>
+        <w:rFonts w:ascii="Symbol" w:hAnsi="Symbol" w:hint="default"/>
+        <w:sz w:val="20"/>
+      </w:rPr>
+    </w:lvl>
+    <w:lvl w:ilvl="1" w:tentative="1">
+      <w:start w:val="1"/>
+      <w:numFmt w:val="bullet"/>
+      <w:lvlText w:val="o"/>
+      <w:lvlJc w:val="left"/>
+      <w:pPr>
+        <w:tabs>
+          <w:tab w:val="num" w:pos="1440"/>
+        </w:tabs>
+        <w:ind w:left="1440" w:hanging="360"/>
+      </w:pPr>
+      <w:rPr>
+        <w:rFonts w:ascii="Courier New" w:hAnsi="Courier New" w:hint="default"/>
+        <w:sz w:val="20"/>
+      </w:rPr>
+    </w:lvl>
+    <w:lvl w:ilvl="2" w:tentative="1">
+      <w:start w:val="1"/>
+      <w:numFmt w:val="bullet"/>
+      <w:lvlText w:val=""/>
+      <w:lvlJc w:val="left"/>
+      <w:pPr>
+        <w:tabs>
+          <w:tab w:val="num" w:pos="2160"/>
+        </w:tabs>
+        <w:ind w:left="2160" w:hanging="360"/>
+      </w:pPr>
+      <w:rPr>
+        <w:rFonts w:ascii="Wingdings" w:hAnsi="Wingdings" w:hint="default"/>
+        <w:sz w:val="20"/>
+      </w:rPr>
+    </w:lvl>
+    <w:lvl w:ilvl="3" w:tentative="1">
+      <w:start w:val="1"/>
+      <w:numFmt w:val="bullet"/>
+      <w:lvlText w:val=""/>
+      <w:lvlJc w:val="left"/>
+      <w:pPr>
+        <w:tabs>
+          <w:tab w:val="num" w:pos="2880"/>
+        </w:tabs>
+        <w:ind w:left="2880" w:hanging="360"/>
+      </w:pPr>
+      <w:rPr>
+        <w:rFonts w:ascii="Wingdings" w:hAnsi="Wingdings" w:hint="default"/>
+        <w:sz w:val="20"/>
+      </w:rPr>
+    </w:lvl>
+    <w:lvl w:ilvl="4" w:tentative="1">
+      <w:start w:val="1"/>
+      <w:numFmt w:val="bullet"/>
+      <w:lvlText w:val=""/>
+      <w:lvlJc w:val="left"/>
+      <w:pPr>
+        <w:tabs>
+          <w:tab w:val="num" w:pos="3600"/>
+        </w:tabs>
+        <w:ind w:left="3600" w:hanging="360"/>
+      </w:pPr>
+      <w:rPr>
+        <w:rFonts w:ascii="Wingdings" w:hAnsi="Wingdings" w:hint="default"/>
+        <w:sz w:val="20"/>
+      </w:rPr>
+    </w:lvl>
+    <w:lvl w:ilvl="5" w:tentative="1">
+      <w:start w:val="1"/>
+      <w:numFmt w:val="bullet"/>
+      <w:lvlText w:val=""/>
+      <w:lvlJc w:val="left"/>
+      <w:pPr>
+        <w:tabs>
+          <w:tab w:val="num" w:pos="4320"/>
+        </w:tabs>
+        <w:ind w:left="4320" w:hanging="360"/>
+      </w:pPr>
+      <w:rPr>
+        <w:rFonts w:ascii="Wingdings" w:hAnsi="Wingdings" w:hint="default"/>
+        <w:sz w:val="20"/>
+      </w:rPr>
+    </w:lvl>
+    <w:lvl w:ilvl="6" w:tentative="1">
+      <w:start w:val="1"/>
+      <w:numFmt w:val="bullet"/>
+      <w:lvlText w:val=""/>
+      <w:lvlJc w:val="left"/>
+      <w:pPr>
+        <w:tabs>
+          <w:tab w:val="num" w:pos="5040"/>
+        </w:tabs>
+        <w:ind w:left="5040" w:hanging="360"/>
+      </w:pPr>
+      <w:rPr>
+        <w:rFonts w:ascii="Wingdings" w:hAnsi="Wingdings" w:hint="default"/>
+        <w:sz w:val="20"/>
+      </w:rPr>
+    </w:lvl>
+    <w:lvl w:ilvl="7" w:tentative="1">
+      <w:start w:val="1"/>
+      <w:numFmt w:val="bullet"/>
+      <w:lvlText w:val=""/>
+      <w:lvlJc w:val="left"/>
+      <w:pPr>
+        <w:tabs>
+          <w:tab w:val="num" w:pos="5760"/>
+        </w:tabs>
+        <w:ind w:left="5760" w:hanging="360"/>
+      </w:pPr>
+      <w:rPr>
+        <w:rFonts w:ascii="Wingdings" w:hAnsi="Wingdings" w:hint="default"/>
+        <w:sz w:val="20"/>
+      </w:rPr>
+    </w:lvl>
+    <w:lvl w:ilvl="8" w:tentative="1">
+      <w:start w:val="1"/>
+      <w:numFmt w:val="bullet"/>
+      <w:lvlText w:val=""/>
+      <w:lvlJc w:val="left"/>
+      <w:pPr>
+        <w:tabs>
+          <w:tab w:val="num" w:pos="6480"/>
+        </w:tabs>
+        <w:ind w:left="6480" w:hanging="360"/>
+      </w:pPr>
+      <w:rPr>
+        <w:rFonts w:ascii="Wingdings" w:hAnsi="Wingdings" w:hint="default"/>
+        <w:sz w:val="20"/>
+      </w:rPr>
+    </w:lvl>
+  </w:abstractNum>
+  <w:abstractNum w:abstractNumId="23" w15:restartNumberingAfterBreak="0">
+    <w:nsid w:val="6DC03257"/>
+    <w:multiLevelType w:val="multilevel"/>
+    <w:tmpl w:val="FF6C6FE4"/>
+    <w:lvl w:ilvl="0">
+      <w:start w:val="1"/>
+      <w:numFmt w:val="bullet"/>
+      <w:lvlText w:val=""/>
+      <w:lvlJc w:val="left"/>
+      <w:pPr>
+        <w:tabs>
+          <w:tab w:val="num" w:pos="720"/>
+        </w:tabs>
+        <w:ind w:left="720" w:hanging="360"/>
+      </w:pPr>
+      <w:rPr>
+        <w:rFonts w:ascii="Symbol" w:hAnsi="Symbol" w:hint="default"/>
+        <w:sz w:val="20"/>
+      </w:rPr>
+    </w:lvl>
+    <w:lvl w:ilvl="1" w:tentative="1">
+      <w:start w:val="1"/>
+      <w:numFmt w:val="bullet"/>
+      <w:lvlText w:val="o"/>
+      <w:lvlJc w:val="left"/>
+      <w:pPr>
+        <w:tabs>
+          <w:tab w:val="num" w:pos="1440"/>
+        </w:tabs>
+        <w:ind w:left="1440" w:hanging="360"/>
+      </w:pPr>
+      <w:rPr>
+        <w:rFonts w:ascii="Courier New" w:hAnsi="Courier New" w:hint="default"/>
+        <w:sz w:val="20"/>
+      </w:rPr>
+    </w:lvl>
+    <w:lvl w:ilvl="2" w:tentative="1">
+      <w:start w:val="1"/>
+      <w:numFmt w:val="bullet"/>
+      <w:lvlText w:val=""/>
+      <w:lvlJc w:val="left"/>
+      <w:pPr>
+        <w:tabs>
+          <w:tab w:val="num" w:pos="2160"/>
+        </w:tabs>
+        <w:ind w:left="2160" w:hanging="360"/>
+      </w:pPr>
+      <w:rPr>
+        <w:rFonts w:ascii="Wingdings" w:hAnsi="Wingdings" w:hint="default"/>
+        <w:sz w:val="20"/>
+      </w:rPr>
+    </w:lvl>
+    <w:lvl w:ilvl="3" w:tentative="1">
+      <w:start w:val="1"/>
+      <w:numFmt w:val="bullet"/>
+      <w:lvlText w:val=""/>
+      <w:lvlJc w:val="left"/>
+      <w:pPr>
+        <w:tabs>
+          <w:tab w:val="num" w:pos="2880"/>
+        </w:tabs>
+        <w:ind w:left="2880" w:hanging="360"/>
+      </w:pPr>
+      <w:rPr>
+        <w:rFonts w:ascii="Wingdings" w:hAnsi="Wingdings" w:hint="default"/>
+        <w:sz w:val="20"/>
+      </w:rPr>
+    </w:lvl>
+    <w:lvl w:ilvl="4" w:tentative="1">
+      <w:start w:val="1"/>
+      <w:numFmt w:val="bullet"/>
+      <w:lvlText w:val=""/>
+      <w:lvlJc w:val="left"/>
+      <w:pPr>
+        <w:tabs>
+          <w:tab w:val="num" w:pos="3600"/>
+        </w:tabs>
+        <w:ind w:left="3600" w:hanging="360"/>
+      </w:pPr>
+      <w:rPr>
+        <w:rFonts w:ascii="Wingdings" w:hAnsi="Wingdings" w:hint="default"/>
+        <w:sz w:val="20"/>
+      </w:rPr>
+    </w:lvl>
+    <w:lvl w:ilvl="5" w:tentative="1">
+      <w:start w:val="1"/>
+      <w:numFmt w:val="bullet"/>
+      <w:lvlText w:val=""/>
+      <w:lvlJc w:val="left"/>
+      <w:pPr>
+        <w:tabs>
+          <w:tab w:val="num" w:pos="4320"/>
+        </w:tabs>
+        <w:ind w:left="4320" w:hanging="360"/>
+      </w:pPr>
+      <w:rPr>
+        <w:rFonts w:ascii="Wingdings" w:hAnsi="Wingdings" w:hint="default"/>
+        <w:sz w:val="20"/>
+      </w:rPr>
+    </w:lvl>
+    <w:lvl w:ilvl="6" w:tentative="1">
+      <w:start w:val="1"/>
+      <w:numFmt w:val="bullet"/>
+      <w:lvlText w:val=""/>
+      <w:lvlJc w:val="left"/>
+      <w:pPr>
+        <w:tabs>
+          <w:tab w:val="num" w:pos="5040"/>
+        </w:tabs>
+        <w:ind w:left="5040" w:hanging="360"/>
+      </w:pPr>
+      <w:rPr>
+        <w:rFonts w:ascii="Wingdings" w:hAnsi="Wingdings" w:hint="default"/>
+        <w:sz w:val="20"/>
+      </w:rPr>
+    </w:lvl>
+    <w:lvl w:ilvl="7" w:tentative="1">
+      <w:start w:val="1"/>
+      <w:numFmt w:val="bullet"/>
+      <w:lvlText w:val=""/>
+      <w:lvlJc w:val="left"/>
+      <w:pPr>
+        <w:tabs>
+          <w:tab w:val="num" w:pos="5760"/>
+        </w:tabs>
+        <w:ind w:left="5760" w:hanging="360"/>
+      </w:pPr>
+      <w:rPr>
+        <w:rFonts w:ascii="Wingdings" w:hAnsi="Wingdings" w:hint="default"/>
+        <w:sz w:val="20"/>
+      </w:rPr>
+    </w:lvl>
+    <w:lvl w:ilvl="8" w:tentative="1">
+      <w:start w:val="1"/>
+      <w:numFmt w:val="bullet"/>
+      <w:lvlText w:val=""/>
+      <w:lvlJc w:val="left"/>
+      <w:pPr>
+        <w:tabs>
+          <w:tab w:val="num" w:pos="6480"/>
+        </w:tabs>
+        <w:ind w:left="6480" w:hanging="360"/>
+      </w:pPr>
+      <w:rPr>
+        <w:rFonts w:ascii="Wingdings" w:hAnsi="Wingdings" w:hint="default"/>
+        <w:sz w:val="20"/>
+      </w:rPr>
+    </w:lvl>
+  </w:abstractNum>
+  <w:abstractNum w:abstractNumId="24" w15:restartNumberingAfterBreak="0">
     <w:nsid w:val="7E721DA9"/>
     <w:multiLevelType w:val="multilevel"/>
     <w:tmpl w:val="4CCC89B8"/>
@@ -3624,33 +6661,78 @@
     </w:lvl>
   </w:abstractNum>
   <w:num w:numId="1" w16cid:durableId="2060471805">
+    <w:abstractNumId w:val="19"/>
+  </w:num>
+  <w:num w:numId="2" w16cid:durableId="428043428">
     <w:abstractNumId w:val="7"/>
   </w:num>
-  <w:num w:numId="2" w16cid:durableId="428043428">
+  <w:num w:numId="3" w16cid:durableId="1932397361">
     <w:abstractNumId w:val="3"/>
   </w:num>
-  <w:num w:numId="3" w16cid:durableId="1932397361">
+  <w:num w:numId="4" w16cid:durableId="865867858">
+    <w:abstractNumId w:val="4"/>
+  </w:num>
+  <w:num w:numId="5" w16cid:durableId="1457024150">
+    <w:abstractNumId w:val="11"/>
+  </w:num>
+  <w:num w:numId="6" w16cid:durableId="1623414663">
     <w:abstractNumId w:val="1"/>
   </w:num>
-  <w:num w:numId="4" w16cid:durableId="865867858">
+  <w:num w:numId="7" w16cid:durableId="986012163">
+    <w:abstractNumId w:val="9"/>
+  </w:num>
+  <w:num w:numId="8" w16cid:durableId="1708985019">
+    <w:abstractNumId w:val="24"/>
+  </w:num>
+  <w:num w:numId="9" w16cid:durableId="1320886425">
+    <w:abstractNumId w:val="20"/>
+  </w:num>
+  <w:num w:numId="10" w16cid:durableId="1432698231">
+    <w:abstractNumId w:val="18"/>
+  </w:num>
+  <w:num w:numId="11" w16cid:durableId="269051057">
+    <w:abstractNumId w:val="10"/>
+  </w:num>
+  <w:num w:numId="12" w16cid:durableId="559898721">
+    <w:abstractNumId w:val="5"/>
+  </w:num>
+  <w:num w:numId="13" w16cid:durableId="1372804891">
+    <w:abstractNumId w:val="17"/>
+  </w:num>
+  <w:num w:numId="14" w16cid:durableId="293097403">
+    <w:abstractNumId w:val="21"/>
+  </w:num>
+  <w:num w:numId="15" w16cid:durableId="1981764647">
+    <w:abstractNumId w:val="23"/>
+  </w:num>
+  <w:num w:numId="16" w16cid:durableId="1979068590">
+    <w:abstractNumId w:val="8"/>
+  </w:num>
+  <w:num w:numId="17" w16cid:durableId="877552894">
+    <w:abstractNumId w:val="16"/>
+  </w:num>
+  <w:num w:numId="18" w16cid:durableId="1723599809">
+    <w:abstractNumId w:val="15"/>
+  </w:num>
+  <w:num w:numId="19" w16cid:durableId="651181782">
+    <w:abstractNumId w:val="12"/>
+  </w:num>
+  <w:num w:numId="20" w16cid:durableId="267854482">
+    <w:abstractNumId w:val="22"/>
+  </w:num>
+  <w:num w:numId="21" w16cid:durableId="2002347602">
+    <w:abstractNumId w:val="0"/>
+  </w:num>
+  <w:num w:numId="22" w16cid:durableId="1480227391">
+    <w:abstractNumId w:val="14"/>
+  </w:num>
+  <w:num w:numId="23" w16cid:durableId="158008844">
     <w:abstractNumId w:val="2"/>
   </w:num>
-  <w:num w:numId="5" w16cid:durableId="1457024150">
-    <w:abstractNumId w:val="5"/>
+  <w:num w:numId="24" w16cid:durableId="1391150645">
+    <w:abstractNumId w:val="13"/>
   </w:num>
-  <w:num w:numId="6" w16cid:durableId="1623414663">
-    <w:abstractNumId w:val="0"/>
-  </w:num>
-  <w:num w:numId="7" w16cid:durableId="986012163">
-    <w:abstractNumId w:val="4"/>
-  </w:num>
-  <w:num w:numId="8" w16cid:durableId="1708985019">
-    <w:abstractNumId w:val="9"/>
-  </w:num>
-  <w:num w:numId="9" w16cid:durableId="1320886425">
-    <w:abstractNumId w:val="8"/>
-  </w:num>
-  <w:num w:numId="10" w16cid:durableId="1432698231">
+  <w:num w:numId="25" w16cid:durableId="473063972">
     <w:abstractNumId w:val="6"/>
   </w:num>
 </w:numbering>
@@ -4258,6 +7340,7 @@
   <w:style w:type="character" w:default="1" w:styleId="DefaultParagraphFont">
     <w:name w:val="Default Paragraph Font"/>
     <w:uiPriority w:val="1"/>
+    <w:semiHidden/>
     <w:unhideWhenUsed/>
   </w:style>
   <w:style w:type="table" w:default="1" w:styleId="TableNormal">

</xml_diff>